<commit_message>
Update manual Frequencying module
</commit_message>
<xml_diff>
--- a/Manuels/Manuel_Frequencying_module.docx
+++ b/Manuels/Manuel_Frequencying_module.docx
@@ -10,6 +10,7 @@
           <w:lang w:val="en-US"/>
         </w:rPr>
       </w:pPr>
+      <w:proofErr w:type="spellStart"/>
       <w:r>
         <w:rPr>
           <w:rFonts w:ascii="Calibri" w:hAnsi="Calibri" w:cs="Calibri"/>
@@ -19,6 +20,7 @@
         </w:rPr>
         <w:t>EEGpal</w:t>
       </w:r>
+      <w:proofErr w:type="spellEnd"/>
       <w:r>
         <w:rPr>
           <w:rFonts w:ascii="Calibri" w:hAnsi="Calibri" w:cs="Calibri"/>
@@ -26,6 +28,7 @@
         </w:rPr>
         <w:t xml:space="preserve">: </w:t>
       </w:r>
+      <w:proofErr w:type="spellStart"/>
       <w:r>
         <w:rPr>
           <w:rFonts w:ascii="Calibri" w:hAnsi="Calibri" w:cs="Calibri"/>
@@ -35,6 +38,7 @@
         </w:rPr>
         <w:t>Frequencying</w:t>
       </w:r>
+      <w:proofErr w:type="spellEnd"/>
       <w:r>
         <w:rPr>
           <w:rFonts w:ascii="Calibri" w:hAnsi="Calibri" w:cs="Calibri"/>
@@ -163,6 +167,7 @@
         </w:rPr>
         <w:t>The '</w:t>
       </w:r>
+      <w:proofErr w:type="spellStart"/>
       <w:r>
         <w:rPr>
           <w:rFonts w:ascii="Calibri" w:hAnsi="Calibri" w:cs="Calibri"/>
@@ -170,6 +175,7 @@
         </w:rPr>
         <w:t>Frequencying</w:t>
       </w:r>
+      <w:proofErr w:type="spellEnd"/>
       <w:r>
         <w:rPr>
           <w:rFonts w:ascii="Calibri" w:hAnsi="Calibri" w:cs="Calibri"/>
@@ -177,6 +183,7 @@
         </w:rPr>
         <w:t xml:space="preserve">' module can be used to </w:t>
       </w:r>
+      <w:proofErr w:type="gramStart"/>
       <w:r>
         <w:rPr>
           <w:rFonts w:ascii="Calibri" w:hAnsi="Calibri" w:cs="Calibri"/>
@@ -184,6 +191,7 @@
         </w:rPr>
         <w:t>performed</w:t>
       </w:r>
+      <w:proofErr w:type="gramEnd"/>
       <w:r>
         <w:rPr>
           <w:rFonts w:ascii="Calibri" w:hAnsi="Calibri" w:cs="Calibri"/>
@@ -233,7 +241,37 @@
           <w:rFonts w:ascii="Calibri" w:hAnsi="Calibri" w:cs="Calibri"/>
           <w:lang w:val="en-US"/>
         </w:rPr>
-        <w:t>(unit : µV</w:t>
+        <w:t>(</w:t>
+      </w:r>
+      <w:proofErr w:type="gramStart"/>
+      <w:r>
+        <w:rPr>
+          <w:rFonts w:ascii="Calibri" w:hAnsi="Calibri" w:cs="Calibri"/>
+          <w:lang w:val="en-US"/>
+        </w:rPr>
+        <w:t>unit :</w:t>
+      </w:r>
+      <w:proofErr w:type="gramEnd"/>
+      <w:r>
+        <w:rPr>
+          <w:rFonts w:ascii="Calibri" w:hAnsi="Calibri" w:cs="Calibri"/>
+          <w:lang w:val="en-US"/>
+        </w:rPr>
+        <w:t xml:space="preserve"> </w:t>
+      </w:r>
+      <w:r>
+        <w:rPr>
+          <w:rFonts w:ascii="Calibri" w:hAnsi="Calibri" w:cs="Calibri"/>
+          <w:lang w:val="en-US"/>
+        </w:rPr>
+        <w:t xml:space="preserve">proportional to </w:t>
+      </w:r>
+      <w:r>
+        <w:rPr>
+          <w:rFonts w:ascii="Calibri" w:hAnsi="Calibri" w:cs="Calibri"/>
+          <w:lang w:val="en-US"/>
+        </w:rPr>
+        <w:t>µV</w:t>
       </w:r>
       <w:r>
         <w:rPr>
@@ -248,7 +286,14 @@
           <w:rFonts w:ascii="Calibri" w:hAnsi="Calibri" w:cs="Calibri"/>
           <w:lang w:val="en-US"/>
         </w:rPr>
-        <w:t xml:space="preserve">/Hz). </w:t>
+        <w:t>, see FAQ for more details</w:t>
+      </w:r>
+      <w:r>
+        <w:rPr>
+          <w:rFonts w:ascii="Calibri" w:hAnsi="Calibri" w:cs="Calibri"/>
+          <w:lang w:val="en-US"/>
+        </w:rPr>
+        <w:t xml:space="preserve">). </w:t>
       </w:r>
       <w:r>
         <w:rPr>
@@ -477,14 +522,24 @@
           <w:lang w:val="en-US"/>
         </w:rPr>
       </w:pPr>
+      <w:proofErr w:type="spellStart"/>
       <w:r>
         <w:rPr>
           <w:rFonts w:ascii="Calibri" w:hAnsi="Calibri" w:cs="Calibri"/>
           <w:lang w:val="en-US"/>
         </w:rPr>
         <w:lastRenderedPageBreak/>
-        <w:t xml:space="preserve">eeglab (FFT), permit to use the </w:t>
-      </w:r>
+        <w:t>eeglab</w:t>
+      </w:r>
+      <w:proofErr w:type="spellEnd"/>
+      <w:r>
+        <w:rPr>
+          <w:rFonts w:ascii="Calibri" w:hAnsi="Calibri" w:cs="Calibri"/>
+          <w:lang w:val="en-US"/>
+        </w:rPr>
+        <w:t xml:space="preserve"> (FFT), permit to use the </w:t>
+      </w:r>
+      <w:proofErr w:type="spellStart"/>
       <w:r>
         <w:rPr>
           <w:rFonts w:ascii="Calibri" w:hAnsi="Calibri" w:cs="Calibri"/>
@@ -494,12 +549,29 @@
         </w:rPr>
         <w:t>newtimef</w:t>
       </w:r>
-      <w:r>
-        <w:rPr>
-          <w:rFonts w:ascii="Calibri" w:hAnsi="Calibri" w:cs="Calibri"/>
-          <w:lang w:val="en-US"/>
-        </w:rPr>
-        <w:t xml:space="preserve"> function of eeglab to compute the FFT and perform the time-frequency analysis (see FAQ for more details about its functioning).  </w:t>
+      <w:proofErr w:type="spellEnd"/>
+      <w:r>
+        <w:rPr>
+          <w:rFonts w:ascii="Calibri" w:hAnsi="Calibri" w:cs="Calibri"/>
+          <w:lang w:val="en-US"/>
+        </w:rPr>
+        <w:t xml:space="preserve"> function of </w:t>
+      </w:r>
+      <w:proofErr w:type="spellStart"/>
+      <w:r>
+        <w:rPr>
+          <w:rFonts w:ascii="Calibri" w:hAnsi="Calibri" w:cs="Calibri"/>
+          <w:lang w:val="en-US"/>
+        </w:rPr>
+        <w:t>eeglab</w:t>
+      </w:r>
+      <w:proofErr w:type="spellEnd"/>
+      <w:r>
+        <w:rPr>
+          <w:rFonts w:ascii="Calibri" w:hAnsi="Calibri" w:cs="Calibri"/>
+          <w:lang w:val="en-US"/>
+        </w:rPr>
+        <w:t xml:space="preserve"> to compute the FFT and perform the time-frequency analysis (see FAQ for more details about its functioning).  </w:t>
       </w:r>
     </w:p>
     <w:p>
@@ -557,7 +629,39 @@
           <w:rFonts w:ascii="Calibri" w:hAnsi="Calibri" w:cs="Calibri"/>
           <w:lang w:val="en-US"/>
         </w:rPr>
-        <w:t xml:space="preserve">Select the part of the signal on which you want to perform the frequency analysis (onset = start point and offset = end point). Reminder: [ms] = millisecond, [tf] = time frame, End of file = automatically selects the end of the file as offset. </w:t>
+        <w:t>Select the part of the signal on which you want to perform the frequency analysis (onset = start point and offset = end point). Reminder: [</w:t>
+      </w:r>
+      <w:proofErr w:type="spellStart"/>
+      <w:r>
+        <w:rPr>
+          <w:rFonts w:ascii="Calibri" w:hAnsi="Calibri" w:cs="Calibri"/>
+          <w:lang w:val="en-US"/>
+        </w:rPr>
+        <w:t>ms</w:t>
+      </w:r>
+      <w:proofErr w:type="spellEnd"/>
+      <w:r>
+        <w:rPr>
+          <w:rFonts w:ascii="Calibri" w:hAnsi="Calibri" w:cs="Calibri"/>
+          <w:lang w:val="en-US"/>
+        </w:rPr>
+        <w:t>] = millisecond, [</w:t>
+      </w:r>
+      <w:proofErr w:type="spellStart"/>
+      <w:r>
+        <w:rPr>
+          <w:rFonts w:ascii="Calibri" w:hAnsi="Calibri" w:cs="Calibri"/>
+          <w:lang w:val="en-US"/>
+        </w:rPr>
+        <w:t>tf</w:t>
+      </w:r>
+      <w:proofErr w:type="spellEnd"/>
+      <w:r>
+        <w:rPr>
+          <w:rFonts w:ascii="Calibri" w:hAnsi="Calibri" w:cs="Calibri"/>
+          <w:lang w:val="en-US"/>
+        </w:rPr>
+        <w:t xml:space="preserve">] = time frame, End of file = automatically selects the end of the file as offset. </w:t>
       </w:r>
     </w:p>
     <w:p>
@@ -834,7 +938,23 @@
           <w:rFonts w:ascii="Calibri" w:hAnsi="Calibri" w:cs="Calibri"/>
           <w:lang w:val="en-US"/>
         </w:rPr>
-        <w:t xml:space="preserve">This option is available only for classical FFT and FFTA. In eeglab FFT, the Hanning is selected by default. </w:t>
+        <w:t xml:space="preserve">This option is available only for classical FFT and FFTA. In </w:t>
+      </w:r>
+      <w:proofErr w:type="spellStart"/>
+      <w:r>
+        <w:rPr>
+          <w:rFonts w:ascii="Calibri" w:hAnsi="Calibri" w:cs="Calibri"/>
+          <w:lang w:val="en-US"/>
+        </w:rPr>
+        <w:t>eeglab</w:t>
+      </w:r>
+      <w:proofErr w:type="spellEnd"/>
+      <w:r>
+        <w:rPr>
+          <w:rFonts w:ascii="Calibri" w:hAnsi="Calibri" w:cs="Calibri"/>
+          <w:lang w:val="en-US"/>
+        </w:rPr>
+        <w:t xml:space="preserve"> FFT, the Hanning is selected by default. </w:t>
       </w:r>
       <w:r>
         <w:rPr>
@@ -861,7 +981,23 @@
           <w:rFonts w:ascii="Calibri" w:hAnsi="Calibri" w:cs="Calibri"/>
           <w:lang w:val="en-US"/>
         </w:rPr>
-        <w:t>To make the comparison between individuals or groups easier to interpret, you can normalise the power value obtained (for more detail, please consult the FAQ).</w:t>
+        <w:t xml:space="preserve">To make the comparison between individuals or groups easier to interpret, you can </w:t>
+      </w:r>
+      <w:proofErr w:type="spellStart"/>
+      <w:r>
+        <w:rPr>
+          <w:rFonts w:ascii="Calibri" w:hAnsi="Calibri" w:cs="Calibri"/>
+          <w:lang w:val="en-US"/>
+        </w:rPr>
+        <w:t>normalise</w:t>
+      </w:r>
+      <w:proofErr w:type="spellEnd"/>
+      <w:r>
+        <w:rPr>
+          <w:rFonts w:ascii="Calibri" w:hAnsi="Calibri" w:cs="Calibri"/>
+          <w:lang w:val="en-US"/>
+        </w:rPr>
+        <w:t xml:space="preserve"> the power value obtained (for more detail, please consult the FAQ).</w:t>
       </w:r>
       <w:r>
         <w:rPr>
@@ -890,7 +1026,27 @@
           <w:bCs/>
           <w:lang w:val="en-US"/>
         </w:rPr>
-        <w:t>By global averaged Power</w:t>
+        <w:t xml:space="preserve">By global </w:t>
+      </w:r>
+      <w:proofErr w:type="gramStart"/>
+      <w:r>
+        <w:rPr>
+          <w:rFonts w:ascii="Calibri" w:hAnsi="Calibri" w:cs="Calibri"/>
+          <w:b/>
+          <w:bCs/>
+          <w:lang w:val="en-US"/>
+        </w:rPr>
+        <w:t>averaged</w:t>
+      </w:r>
+      <w:proofErr w:type="gramEnd"/>
+      <w:r>
+        <w:rPr>
+          <w:rFonts w:ascii="Calibri" w:hAnsi="Calibri" w:cs="Calibri"/>
+          <w:b/>
+          <w:bCs/>
+          <w:lang w:val="en-US"/>
+        </w:rPr>
+        <w:t xml:space="preserve"> Power</w:t>
       </w:r>
       <w:r>
         <w:rPr>
@@ -956,7 +1112,23 @@
           <w:rFonts w:ascii="Calibri" w:hAnsi="Calibri" w:cs="Calibri"/>
           <w:lang w:val="en-US"/>
         </w:rPr>
-        <w:t>The power of each frequency is divided by the mean power of that particular frequency across all the electrodes. This flattens the power distribution across frequencies, correcting for the higher power found in low frequencies compared to high frequencies.</w:t>
+        <w:t xml:space="preserve">The power of each frequency is divided by the mean power of that </w:t>
+      </w:r>
+      <w:proofErr w:type="gramStart"/>
+      <w:r>
+        <w:rPr>
+          <w:rFonts w:ascii="Calibri" w:hAnsi="Calibri" w:cs="Calibri"/>
+          <w:lang w:val="en-US"/>
+        </w:rPr>
+        <w:t>particular frequency</w:t>
+      </w:r>
+      <w:proofErr w:type="gramEnd"/>
+      <w:r>
+        <w:rPr>
+          <w:rFonts w:ascii="Calibri" w:hAnsi="Calibri" w:cs="Calibri"/>
+          <w:lang w:val="en-US"/>
+        </w:rPr>
+        <w:t xml:space="preserve"> across all the electrodes. This flattens the power distribution across frequencies, correcting for the higher power found in low frequencies compared to high frequencies.</w:t>
       </w:r>
     </w:p>
     <w:p>
@@ -1007,7 +1179,23 @@
           <w:rFonts w:ascii="Calibri" w:hAnsi="Calibri" w:cs="Calibri"/>
           <w:lang w:val="en-US"/>
         </w:rPr>
-        <w:t xml:space="preserve"> (similar as EEGLAB). This is not recommended due to strange result and literature (look at the FAQ for more details).</w:t>
+        <w:t xml:space="preserve"> (similar as EEGLAB). This is not recommended due to strange </w:t>
+      </w:r>
+      <w:proofErr w:type="gramStart"/>
+      <w:r>
+        <w:rPr>
+          <w:rFonts w:ascii="Calibri" w:hAnsi="Calibri" w:cs="Calibri"/>
+          <w:lang w:val="en-US"/>
+        </w:rPr>
+        <w:t>result</w:t>
+      </w:r>
+      <w:proofErr w:type="gramEnd"/>
+      <w:r>
+        <w:rPr>
+          <w:rFonts w:ascii="Calibri" w:hAnsi="Calibri" w:cs="Calibri"/>
+          <w:lang w:val="en-US"/>
+        </w:rPr>
+        <w:t xml:space="preserve"> and literature (look at the FAQ for more details).</w:t>
       </w:r>
     </w:p>
     <w:p>
@@ -1241,7 +1429,23 @@
           <w:rFonts w:ascii="Calibri" w:hAnsi="Calibri" w:cs="Calibri"/>
           <w:lang w:val="en-US"/>
         </w:rPr>
-        <w:t xml:space="preserve">ensity for each EEG electrode and for each individual frequency within the specified range. The GPS provides </w:t>
+        <w:t xml:space="preserve">ensity for each EEG electrode and for each individual frequency within the specified range. </w:t>
+      </w:r>
+      <w:proofErr w:type="gramStart"/>
+      <w:r>
+        <w:rPr>
+          <w:rFonts w:ascii="Calibri" w:hAnsi="Calibri" w:cs="Calibri"/>
+          <w:lang w:val="en-US"/>
+        </w:rPr>
+        <w:t>The GPS</w:t>
+      </w:r>
+      <w:proofErr w:type="gramEnd"/>
+      <w:r>
+        <w:rPr>
+          <w:rFonts w:ascii="Calibri" w:hAnsi="Calibri" w:cs="Calibri"/>
+          <w:lang w:val="en-US"/>
+        </w:rPr>
+        <w:t xml:space="preserve"> provides </w:t>
       </w:r>
       <w:r>
         <w:rPr>
@@ -1361,7 +1565,23 @@
           <w:rFonts w:ascii="Calibri" w:hAnsi="Calibri" w:cs="Calibri"/>
           <w:lang w:val="en-US"/>
         </w:rPr>
-        <w:t>. These options are only available if you have entered a frequency band of interest.</w:t>
+        <w:t xml:space="preserve">. These options are only available if you have entered a </w:t>
+      </w:r>
+      <w:proofErr w:type="gramStart"/>
+      <w:r>
+        <w:rPr>
+          <w:rFonts w:ascii="Calibri" w:hAnsi="Calibri" w:cs="Calibri"/>
+          <w:lang w:val="en-US"/>
+        </w:rPr>
+        <w:t>frequency</w:t>
+      </w:r>
+      <w:proofErr w:type="gramEnd"/>
+      <w:r>
+        <w:rPr>
+          <w:rFonts w:ascii="Calibri" w:hAnsi="Calibri" w:cs="Calibri"/>
+          <w:lang w:val="en-US"/>
+        </w:rPr>
+        <w:t xml:space="preserve"> band of interest.</w:t>
       </w:r>
     </w:p>
     <w:p>
@@ -1418,7 +1638,64 @@
           <w:rFonts w:ascii="Calibri" w:hAnsi="Calibri" w:cs="Calibri"/>
           <w:lang w:val="en-US"/>
         </w:rPr>
-        <w:t>Select the format for the PSD output files. Files with the .freq extension can be opened in Cartool. Otherwise, you can save them as a Matlab variable (.mat).</w:t>
+        <w:t xml:space="preserve">Select the format for the PSD output files. Files with </w:t>
+      </w:r>
+      <w:proofErr w:type="gramStart"/>
+      <w:r>
+        <w:rPr>
+          <w:rFonts w:ascii="Calibri" w:hAnsi="Calibri" w:cs="Calibri"/>
+          <w:lang w:val="en-US"/>
+        </w:rPr>
+        <w:t>the .</w:t>
+      </w:r>
+      <w:proofErr w:type="spellStart"/>
+      <w:r>
+        <w:rPr>
+          <w:rFonts w:ascii="Calibri" w:hAnsi="Calibri" w:cs="Calibri"/>
+          <w:lang w:val="en-US"/>
+        </w:rPr>
+        <w:t>freq</w:t>
+      </w:r>
+      <w:proofErr w:type="spellEnd"/>
+      <w:proofErr w:type="gramEnd"/>
+      <w:r>
+        <w:rPr>
+          <w:rFonts w:ascii="Calibri" w:hAnsi="Calibri" w:cs="Calibri"/>
+          <w:lang w:val="en-US"/>
+        </w:rPr>
+        <w:t xml:space="preserve"> extension can be opened in </w:t>
+      </w:r>
+      <w:proofErr w:type="spellStart"/>
+      <w:r>
+        <w:rPr>
+          <w:rFonts w:ascii="Calibri" w:hAnsi="Calibri" w:cs="Calibri"/>
+          <w:lang w:val="en-US"/>
+        </w:rPr>
+        <w:t>Cartool</w:t>
+      </w:r>
+      <w:proofErr w:type="spellEnd"/>
+      <w:r>
+        <w:rPr>
+          <w:rFonts w:ascii="Calibri" w:hAnsi="Calibri" w:cs="Calibri"/>
+          <w:lang w:val="en-US"/>
+        </w:rPr>
+        <w:t xml:space="preserve">. Otherwise, you can save them as a </w:t>
+      </w:r>
+      <w:proofErr w:type="spellStart"/>
+      <w:r>
+        <w:rPr>
+          <w:rFonts w:ascii="Calibri" w:hAnsi="Calibri" w:cs="Calibri"/>
+          <w:lang w:val="en-US"/>
+        </w:rPr>
+        <w:t>Matlab</w:t>
+      </w:r>
+      <w:proofErr w:type="spellEnd"/>
+      <w:r>
+        <w:rPr>
+          <w:rFonts w:ascii="Calibri" w:hAnsi="Calibri" w:cs="Calibri"/>
+          <w:lang w:val="en-US"/>
+        </w:rPr>
+        <w:t xml:space="preserve"> variable (.mat).</w:t>
       </w:r>
     </w:p>
     <w:p>
@@ -1445,14 +1722,30 @@
           <w:rFonts w:ascii="Calibri" w:hAnsi="Calibri" w:cs="Calibri"/>
           <w:lang w:val="en-US"/>
         </w:rPr>
-        <w:t xml:space="preserve"> for the GPS output (</w:t>
-      </w:r>
-      <w:r>
-        <w:rPr>
-          <w:rFonts w:ascii="Calibri" w:hAnsi="Calibri" w:cs="Calibri"/>
-          <w:lang w:val="en-US"/>
-        </w:rPr>
-        <w:t>.xlsx,</w:t>
+        <w:t xml:space="preserve"> for the GPS </w:t>
+      </w:r>
+      <w:proofErr w:type="gramStart"/>
+      <w:r>
+        <w:rPr>
+          <w:rFonts w:ascii="Calibri" w:hAnsi="Calibri" w:cs="Calibri"/>
+          <w:lang w:val="en-US"/>
+        </w:rPr>
+        <w:t>output (</w:t>
+      </w:r>
+      <w:r>
+        <w:rPr>
+          <w:rFonts w:ascii="Calibri" w:hAnsi="Calibri" w:cs="Calibri"/>
+          <w:lang w:val="en-US"/>
+        </w:rPr>
+        <w:t>.</w:t>
+      </w:r>
+      <w:proofErr w:type="gramEnd"/>
+      <w:r>
+        <w:rPr>
+          <w:rFonts w:ascii="Calibri" w:hAnsi="Calibri" w:cs="Calibri"/>
+          <w:lang w:val="en-US"/>
+        </w:rPr>
+        <w:t>xlsx,</w:t>
       </w:r>
       <w:r>
         <w:rPr>
@@ -1482,12 +1775,21 @@
         </w:rPr>
         <w:t xml:space="preserve"> </w:t>
       </w:r>
-      <w:r>
-        <w:rPr>
-          <w:rFonts w:ascii="Calibri" w:hAnsi="Calibri" w:cs="Calibri"/>
-          <w:lang w:val="en-US"/>
-        </w:rPr>
-        <w:t xml:space="preserve">or .ep </w:t>
+      <w:proofErr w:type="gramStart"/>
+      <w:r>
+        <w:rPr>
+          <w:rFonts w:ascii="Calibri" w:hAnsi="Calibri" w:cs="Calibri"/>
+          <w:lang w:val="en-US"/>
+        </w:rPr>
+        <w:t>or .ep</w:t>
+      </w:r>
+      <w:proofErr w:type="gramEnd"/>
+      <w:r>
+        <w:rPr>
+          <w:rFonts w:ascii="Calibri" w:hAnsi="Calibri" w:cs="Calibri"/>
+          <w:lang w:val="en-US"/>
+        </w:rPr>
+        <w:t xml:space="preserve"> </w:t>
       </w:r>
       <w:r>
         <w:rPr>
@@ -1537,6 +1839,7 @@
         </w:rPr>
         <w:t xml:space="preserve">: it will automatically create a sub-folder call </w:t>
       </w:r>
+      <w:proofErr w:type="spellStart"/>
       <w:r>
         <w:rPr>
           <w:rFonts w:ascii="Calibri" w:hAnsi="Calibri" w:cs="Calibri"/>
@@ -1546,6 +1849,7 @@
         </w:rPr>
         <w:t>Frequencying</w:t>
       </w:r>
+      <w:proofErr w:type="spellEnd"/>
       <w:r>
         <w:rPr>
           <w:rFonts w:ascii="Calibri" w:hAnsi="Calibri" w:cs="Calibri"/>
@@ -1643,6 +1947,7 @@
         </w:rPr>
         <w:t xml:space="preserve"> will carry out the processing parameterized in the </w:t>
       </w:r>
+      <w:proofErr w:type="spellStart"/>
       <w:r>
         <w:rPr>
           <w:rFonts w:ascii="Calibri" w:hAnsi="Calibri" w:cs="Calibri"/>
@@ -1650,6 +1955,7 @@
         </w:rPr>
         <w:t>Frequencying</w:t>
       </w:r>
+      <w:proofErr w:type="spellEnd"/>
       <w:r>
         <w:rPr>
           <w:rFonts w:ascii="Calibri" w:hAnsi="Calibri" w:cs="Calibri"/>
@@ -1700,6 +2006,7 @@
         </w:rPr>
         <w:t xml:space="preserve"> button will store all the parameters in memory and close the </w:t>
       </w:r>
+      <w:proofErr w:type="spellStart"/>
       <w:r>
         <w:rPr>
           <w:rFonts w:ascii="Calibri" w:hAnsi="Calibri" w:cs="Calibri"/>
@@ -1707,6 +2014,7 @@
         </w:rPr>
         <w:t>Frequencying</w:t>
       </w:r>
+      <w:proofErr w:type="spellEnd"/>
       <w:r>
         <w:rPr>
           <w:rFonts w:ascii="Calibri" w:hAnsi="Calibri" w:cs="Calibri"/>
@@ -1757,6 +2065,7 @@
         </w:rPr>
         <w:t xml:space="preserve"> closes the module without processing and without keeping the entered parameters in memory. The same effect will be achieved by closing the </w:t>
       </w:r>
+      <w:proofErr w:type="spellStart"/>
       <w:r>
         <w:rPr>
           <w:rFonts w:ascii="Calibri" w:hAnsi="Calibri" w:cs="Calibri"/>
@@ -1764,6 +2073,7 @@
         </w:rPr>
         <w:t>Frequencying</w:t>
       </w:r>
+      <w:proofErr w:type="spellEnd"/>
       <w:r>
         <w:rPr>
           <w:rFonts w:ascii="Calibri" w:hAnsi="Calibri" w:cs="Calibri"/>
@@ -1929,7 +2239,71 @@
           <w:rFonts w:ascii="Calibri" w:hAnsi="Calibri" w:cs="Calibri"/>
           <w:lang w:val="en-US"/>
         </w:rPr>
-        <w:t xml:space="preserve">(for example a+b*i where a in the real component [Re(X(k))] and b is the imaginary component [Im(X(k))] </w:t>
+        <w:t xml:space="preserve">(for example </w:t>
+      </w:r>
+      <w:proofErr w:type="spellStart"/>
+      <w:r>
+        <w:rPr>
+          <w:rFonts w:ascii="Calibri" w:hAnsi="Calibri" w:cs="Calibri"/>
+          <w:lang w:val="en-US"/>
+        </w:rPr>
+        <w:t>a+b</w:t>
+      </w:r>
+      <w:proofErr w:type="spellEnd"/>
+      <w:r>
+        <w:rPr>
+          <w:rFonts w:ascii="Calibri" w:hAnsi="Calibri" w:cs="Calibri"/>
+          <w:lang w:val="en-US"/>
+        </w:rPr>
+        <w:t>*</w:t>
+      </w:r>
+      <w:proofErr w:type="spellStart"/>
+      <w:r>
+        <w:rPr>
+          <w:rFonts w:ascii="Calibri" w:hAnsi="Calibri" w:cs="Calibri"/>
+          <w:lang w:val="en-US"/>
+        </w:rPr>
+        <w:t>i</w:t>
+      </w:r>
+      <w:proofErr w:type="spellEnd"/>
+      <w:r>
+        <w:rPr>
+          <w:rFonts w:ascii="Calibri" w:hAnsi="Calibri" w:cs="Calibri"/>
+          <w:lang w:val="en-US"/>
+        </w:rPr>
+        <w:t xml:space="preserve"> where a in the real component [Re(X(k))] and b is the imaginary component [</w:t>
+      </w:r>
+      <w:proofErr w:type="spellStart"/>
+      <w:r>
+        <w:rPr>
+          <w:rFonts w:ascii="Calibri" w:hAnsi="Calibri" w:cs="Calibri"/>
+          <w:lang w:val="en-US"/>
+        </w:rPr>
+        <w:t>Im</w:t>
+      </w:r>
+      <w:proofErr w:type="spellEnd"/>
+      <w:r>
+        <w:rPr>
+          <w:rFonts w:ascii="Calibri" w:hAnsi="Calibri" w:cs="Calibri"/>
+          <w:lang w:val="en-US"/>
+        </w:rPr>
+        <w:t>(X(k</w:t>
+      </w:r>
+      <w:proofErr w:type="gramStart"/>
+      <w:r>
+        <w:rPr>
+          <w:rFonts w:ascii="Calibri" w:hAnsi="Calibri" w:cs="Calibri"/>
+          <w:lang w:val="en-US"/>
+        </w:rPr>
+        <w:t>))]</w:t>
+      </w:r>
+      <w:proofErr w:type="gramEnd"/>
+      <w:r>
+        <w:rPr>
+          <w:rFonts w:ascii="Calibri" w:hAnsi="Calibri" w:cs="Calibri"/>
+          <w:lang w:val="en-US"/>
+        </w:rPr>
+        <w:t xml:space="preserve"> </w:t>
       </w:r>
       <w:r>
         <w:rPr>
@@ -2049,7 +2423,23 @@
           <w:rFonts w:ascii="Calibri" w:hAnsi="Calibri" w:cs="Calibri"/>
           <w:lang w:val="en-US"/>
         </w:rPr>
-        <w:t xml:space="preserve"> is a measure that describes the amount of energy contained in that particular frequency. It is calculated by taking the </w:t>
+        <w:t xml:space="preserve"> is a measure that describes the amount of energy contained in that </w:t>
+      </w:r>
+      <w:proofErr w:type="gramStart"/>
+      <w:r>
+        <w:rPr>
+          <w:rFonts w:ascii="Calibri" w:hAnsi="Calibri" w:cs="Calibri"/>
+          <w:lang w:val="en-US"/>
+        </w:rPr>
+        <w:t>particular frequency</w:t>
+      </w:r>
+      <w:proofErr w:type="gramEnd"/>
+      <w:r>
+        <w:rPr>
+          <w:rFonts w:ascii="Calibri" w:hAnsi="Calibri" w:cs="Calibri"/>
+          <w:lang w:val="en-US"/>
+        </w:rPr>
+        <w:t xml:space="preserve">. It is calculated by taking the </w:t>
       </w:r>
       <w:r>
         <w:rPr>
@@ -2188,7 +2578,23 @@
           <w:rFonts w:ascii="Calibri" w:hAnsi="Calibri" w:cs="Calibri"/>
           <w:lang w:val="en-US"/>
         </w:rPr>
-        <w:t xml:space="preserve"> the power, making it comparable between different epoch lengths or between different segments of the signal.</w:t>
+        <w:t xml:space="preserve"> </w:t>
+      </w:r>
+      <w:proofErr w:type="gramStart"/>
+      <w:r>
+        <w:rPr>
+          <w:rFonts w:ascii="Calibri" w:hAnsi="Calibri" w:cs="Calibri"/>
+          <w:lang w:val="en-US"/>
+        </w:rPr>
+        <w:t>the power</w:t>
+      </w:r>
+      <w:proofErr w:type="gramEnd"/>
+      <w:r>
+        <w:rPr>
+          <w:rFonts w:ascii="Calibri" w:hAnsi="Calibri" w:cs="Calibri"/>
+          <w:lang w:val="en-US"/>
+        </w:rPr>
+        <w:t>, making it comparable between different epoch lengths or between different segments of the signal.</w:t>
       </w:r>
     </w:p>
     <w:p>
@@ -2320,7 +2726,71 @@
           <w:rFonts w:ascii="Calibri" w:hAnsi="Calibri" w:cs="Calibri"/>
           <w:lang w:val="en-US"/>
         </w:rPr>
-        <w:t>proposed a way to restore the polarity information between the electrodes. It is the famous FFTA introduced in the Cartool software. In fact, the reconstructed polarity is random and an electrode can be positive on one map and negative on another. To solve this problem, Cartool will use the polarity of the first map to correct all the others (to have the same polarity everywhere). MichaelDP improved the concept by looking for the best map to use as a reference by studying the maps that correlate the most.</w:t>
+        <w:t xml:space="preserve">proposed a way to restore the polarity information between the electrodes. It is the famous FFTA introduced in the </w:t>
+      </w:r>
+      <w:proofErr w:type="spellStart"/>
+      <w:r>
+        <w:rPr>
+          <w:rFonts w:ascii="Calibri" w:hAnsi="Calibri" w:cs="Calibri"/>
+          <w:lang w:val="en-US"/>
+        </w:rPr>
+        <w:t>Cartool</w:t>
+      </w:r>
+      <w:proofErr w:type="spellEnd"/>
+      <w:r>
+        <w:rPr>
+          <w:rFonts w:ascii="Calibri" w:hAnsi="Calibri" w:cs="Calibri"/>
+          <w:lang w:val="en-US"/>
+        </w:rPr>
+        <w:t xml:space="preserve"> software. In fact, the reconstructed polarity is </w:t>
+      </w:r>
+      <w:proofErr w:type="gramStart"/>
+      <w:r>
+        <w:rPr>
+          <w:rFonts w:ascii="Calibri" w:hAnsi="Calibri" w:cs="Calibri"/>
+          <w:lang w:val="en-US"/>
+        </w:rPr>
+        <w:t>random</w:t>
+      </w:r>
+      <w:proofErr w:type="gramEnd"/>
+      <w:r>
+        <w:rPr>
+          <w:rFonts w:ascii="Calibri" w:hAnsi="Calibri" w:cs="Calibri"/>
+          <w:lang w:val="en-US"/>
+        </w:rPr>
+        <w:t xml:space="preserve"> and an electrode can be positive on one map and negative on another. To solve this problem, </w:t>
+      </w:r>
+      <w:proofErr w:type="spellStart"/>
+      <w:r>
+        <w:rPr>
+          <w:rFonts w:ascii="Calibri" w:hAnsi="Calibri" w:cs="Calibri"/>
+          <w:lang w:val="en-US"/>
+        </w:rPr>
+        <w:t>Cartool</w:t>
+      </w:r>
+      <w:proofErr w:type="spellEnd"/>
+      <w:r>
+        <w:rPr>
+          <w:rFonts w:ascii="Calibri" w:hAnsi="Calibri" w:cs="Calibri"/>
+          <w:lang w:val="en-US"/>
+        </w:rPr>
+        <w:t xml:space="preserve"> will use the polarity of the first map to correct all the others (to have the same polarity everywhere). </w:t>
+      </w:r>
+      <w:proofErr w:type="spellStart"/>
+      <w:r>
+        <w:rPr>
+          <w:rFonts w:ascii="Calibri" w:hAnsi="Calibri" w:cs="Calibri"/>
+          <w:lang w:val="en-US"/>
+        </w:rPr>
+        <w:t>MichaelDP</w:t>
+      </w:r>
+      <w:proofErr w:type="spellEnd"/>
+      <w:r>
+        <w:rPr>
+          <w:rFonts w:ascii="Calibri" w:hAnsi="Calibri" w:cs="Calibri"/>
+          <w:lang w:val="en-US"/>
+        </w:rPr>
+        <w:t xml:space="preserve"> improved the concept by looking for the best map to use as a reference by studying the maps that correlate the most.</w:t>
       </w:r>
     </w:p>
     <w:p>
@@ -2348,61 +2818,95 @@
           <w:lang w:val="en-US"/>
         </w:rPr>
         <w:lastRenderedPageBreak/>
-        <w:t xml:space="preserve">Why does the choice of window length affect my frequency analysis (point 3)? </w:t>
-      </w:r>
-    </w:p>
-    <w:p>
-      <w:pPr>
-        <w:rPr>
-          <w:rFonts w:ascii="Calibri" w:hAnsi="Calibri" w:cs="Calibri"/>
-          <w:lang w:val="en-US"/>
-        </w:rPr>
-      </w:pPr>
-      <w:r>
-        <w:rPr>
-          <w:rFonts w:ascii="Calibri" w:hAnsi="Calibri" w:cs="Calibri"/>
-          <w:lang w:val="en-US"/>
-        </w:rPr>
-        <w:t>The highest frequency you can analyse is always half the window length. For example, if my window is 1000 ms, the maximum frequency of my analysis will be 500 Hz (in the case of a sampling rate at 1000Hz). This is because of the Nyquist theorem. The maximum frequency is shown in the interface at position 5.</w:t>
-      </w:r>
-    </w:p>
-    <w:p>
-      <w:pPr>
+        <w:t xml:space="preserve">Why does the choice of </w:t>
+      </w:r>
+      <w:proofErr w:type="gramStart"/>
+      <w:r>
         <w:rPr>
           <w:rFonts w:ascii="Calibri" w:hAnsi="Calibri" w:cs="Calibri"/>
           <w:b/>
           <w:bCs/>
           <w:lang w:val="en-US"/>
         </w:rPr>
-      </w:pPr>
-    </w:p>
-    <w:p>
-      <w:pPr>
+        <w:t>window length</w:t>
+      </w:r>
+      <w:proofErr w:type="gramEnd"/>
+      <w:r>
         <w:rPr>
           <w:rFonts w:ascii="Calibri" w:hAnsi="Calibri" w:cs="Calibri"/>
           <w:b/>
           <w:bCs/>
           <w:lang w:val="en-US"/>
         </w:rPr>
-      </w:pPr>
-      <w:r>
+        <w:t xml:space="preserve"> affect my frequency analysis (point 3)? </w:t>
+      </w:r>
+    </w:p>
+    <w:p>
+      <w:pPr>
+        <w:rPr>
+          <w:rFonts w:ascii="Calibri" w:hAnsi="Calibri" w:cs="Calibri"/>
+          <w:lang w:val="en-US"/>
+        </w:rPr>
+      </w:pPr>
+      <w:r>
+        <w:rPr>
+          <w:rFonts w:ascii="Calibri" w:hAnsi="Calibri" w:cs="Calibri"/>
+          <w:lang w:val="en-US"/>
+        </w:rPr>
+        <w:t xml:space="preserve">The highest frequency you can </w:t>
+      </w:r>
+      <w:proofErr w:type="spellStart"/>
+      <w:r>
+        <w:rPr>
+          <w:rFonts w:ascii="Calibri" w:hAnsi="Calibri" w:cs="Calibri"/>
+          <w:lang w:val="en-US"/>
+        </w:rPr>
+        <w:t>analyse</w:t>
+      </w:r>
+      <w:proofErr w:type="spellEnd"/>
+      <w:r>
+        <w:rPr>
+          <w:rFonts w:ascii="Calibri" w:hAnsi="Calibri" w:cs="Calibri"/>
+          <w:lang w:val="en-US"/>
+        </w:rPr>
+        <w:t xml:space="preserve"> is always half the window length. For example, if my window is 1000 </w:t>
+      </w:r>
+      <w:proofErr w:type="spellStart"/>
+      <w:r>
+        <w:rPr>
+          <w:rFonts w:ascii="Calibri" w:hAnsi="Calibri" w:cs="Calibri"/>
+          <w:lang w:val="en-US"/>
+        </w:rPr>
+        <w:t>ms</w:t>
+      </w:r>
+      <w:proofErr w:type="spellEnd"/>
+      <w:r>
+        <w:rPr>
+          <w:rFonts w:ascii="Calibri" w:hAnsi="Calibri" w:cs="Calibri"/>
+          <w:lang w:val="en-US"/>
+        </w:rPr>
+        <w:t>, the maximum frequency of my analysis will be 500 Hz (in the case of a sampling rate at 1000Hz). This is because of the Nyquist theorem. The maximum frequency is shown in the interface at position 5.</w:t>
+      </w:r>
+    </w:p>
+    <w:p>
+      <w:pPr>
         <w:rPr>
           <w:rFonts w:ascii="Calibri" w:hAnsi="Calibri" w:cs="Calibri"/>
           <w:b/>
           <w:bCs/>
           <w:lang w:val="en-US"/>
         </w:rPr>
-        <w:t>What is the windowing function and why should I use it</w:t>
-      </w:r>
-      <w:r>
+      </w:pPr>
+    </w:p>
+    <w:p>
+      <w:pPr>
         <w:rPr>
           <w:rFonts w:ascii="Calibri" w:hAnsi="Calibri" w:cs="Calibri"/>
           <w:b/>
           <w:bCs/>
           <w:lang w:val="en-US"/>
         </w:rPr>
-        <w:t xml:space="preserve"> (point 7)</w:t>
-      </w:r>
+      </w:pPr>
       <w:r>
         <w:rPr>
           <w:rFonts w:ascii="Calibri" w:hAnsi="Calibri" w:cs="Calibri"/>
@@ -2410,6 +2914,24 @@
           <w:bCs/>
           <w:lang w:val="en-US"/>
         </w:rPr>
+        <w:t>What is the windowing function and why should I use it</w:t>
+      </w:r>
+      <w:r>
+        <w:rPr>
+          <w:rFonts w:ascii="Calibri" w:hAnsi="Calibri" w:cs="Calibri"/>
+          <w:b/>
+          <w:bCs/>
+          <w:lang w:val="en-US"/>
+        </w:rPr>
+        <w:t xml:space="preserve"> (point 7)</w:t>
+      </w:r>
+      <w:r>
+        <w:rPr>
+          <w:rFonts w:ascii="Calibri" w:hAnsi="Calibri" w:cs="Calibri"/>
+          <w:b/>
+          <w:bCs/>
+          <w:lang w:val="en-US"/>
+        </w:rPr>
         <w:t xml:space="preserve">? </w:t>
       </w:r>
     </w:p>
@@ -2425,7 +2947,23 @@
           <w:rFonts w:ascii="Calibri" w:hAnsi="Calibri" w:cs="Calibri"/>
           <w:lang w:val="en-US"/>
         </w:rPr>
-        <w:t xml:space="preserve">During frequency analysis in EEG, we cut the signal in several time window which introduce discontinuities. The use of a </w:t>
+        <w:t xml:space="preserve">During frequency analysis in EEG, we cut the signal in several time </w:t>
+      </w:r>
+      <w:proofErr w:type="gramStart"/>
+      <w:r>
+        <w:rPr>
+          <w:rFonts w:ascii="Calibri" w:hAnsi="Calibri" w:cs="Calibri"/>
+          <w:lang w:val="en-US"/>
+        </w:rPr>
+        <w:t>window</w:t>
+      </w:r>
+      <w:proofErr w:type="gramEnd"/>
+      <w:r>
+        <w:rPr>
+          <w:rFonts w:ascii="Calibri" w:hAnsi="Calibri" w:cs="Calibri"/>
+          <w:lang w:val="en-US"/>
+        </w:rPr>
+        <w:t xml:space="preserve"> which introduce discontinuities. The use of a </w:t>
       </w:r>
       <w:r>
         <w:rPr>
@@ -2484,7 +3022,57 @@
           <w:rFonts w:ascii="Calibri" w:hAnsi="Calibri" w:cs="Calibri"/>
           <w:lang w:val="en-US"/>
         </w:rPr>
-        <w:t xml:space="preserve"> occurs mainly because of discontinuities at the ends of a signal segment. When performing a Fourier analysis on a finite time segment, it is implicitly assumed that the segment is periodic (that it repeats ad infinitum). If the start and end values of the segment do not match, a discontinuity is created, introducing high frequencies that are not present in the original signal.The consequence could be : </w:t>
+        <w:t xml:space="preserve"> occurs mainly because of discontinuities at the ends of a signal segment. When performing a Fourier analysis on a finite time segment, it is implicitly assumed that the segment is periodic (that it repeats ad infinitum). If the start and end values of the segment do not match, </w:t>
+      </w:r>
+      <w:proofErr w:type="gramStart"/>
+      <w:r>
+        <w:rPr>
+          <w:rFonts w:ascii="Calibri" w:hAnsi="Calibri" w:cs="Calibri"/>
+          <w:lang w:val="en-US"/>
+        </w:rPr>
+        <w:t>a discontinuity</w:t>
+      </w:r>
+      <w:proofErr w:type="gramEnd"/>
+      <w:r>
+        <w:rPr>
+          <w:rFonts w:ascii="Calibri" w:hAnsi="Calibri" w:cs="Calibri"/>
+          <w:lang w:val="en-US"/>
+        </w:rPr>
+        <w:t xml:space="preserve"> is created, introducing high frequencies that are not present in the original </w:t>
+      </w:r>
+      <w:proofErr w:type="spellStart"/>
+      <w:proofErr w:type="gramStart"/>
+      <w:r>
+        <w:rPr>
+          <w:rFonts w:ascii="Calibri" w:hAnsi="Calibri" w:cs="Calibri"/>
+          <w:lang w:val="en-US"/>
+        </w:rPr>
+        <w:t>signal.The</w:t>
+      </w:r>
+      <w:proofErr w:type="spellEnd"/>
+      <w:proofErr w:type="gramEnd"/>
+      <w:r>
+        <w:rPr>
+          <w:rFonts w:ascii="Calibri" w:hAnsi="Calibri" w:cs="Calibri"/>
+          <w:lang w:val="en-US"/>
+        </w:rPr>
+        <w:t xml:space="preserve"> consequence could </w:t>
+      </w:r>
+      <w:proofErr w:type="gramStart"/>
+      <w:r>
+        <w:rPr>
+          <w:rFonts w:ascii="Calibri" w:hAnsi="Calibri" w:cs="Calibri"/>
+          <w:lang w:val="en-US"/>
+        </w:rPr>
+        <w:t>be :</w:t>
+      </w:r>
+      <w:proofErr w:type="gramEnd"/>
+      <w:r>
+        <w:rPr>
+          <w:rFonts w:ascii="Calibri" w:hAnsi="Calibri" w:cs="Calibri"/>
+          <w:lang w:val="en-US"/>
+        </w:rPr>
+        <w:t xml:space="preserve"> </w:t>
       </w:r>
     </w:p>
     <w:p>
@@ -2507,7 +3095,23 @@
           <w:rFonts w:ascii="Calibri" w:hAnsi="Calibri" w:cs="Calibri"/>
           <w:lang w:val="en-US"/>
         </w:rPr>
-        <w:t>Dispersion of energy over several frequencies: Instead of being concentrated on the frequency of interest, the energy ‘leaks’ into neighbouring frequencies, making the peak less clear and making it difficult to identify certain frequencies accurately.</w:t>
+        <w:t xml:space="preserve">Dispersion of energy over several frequencies: Instead of being concentrated on the frequency of interest, the energy ‘leaks’ into </w:t>
+      </w:r>
+      <w:proofErr w:type="spellStart"/>
+      <w:r>
+        <w:rPr>
+          <w:rFonts w:ascii="Calibri" w:hAnsi="Calibri" w:cs="Calibri"/>
+          <w:lang w:val="en-US"/>
+        </w:rPr>
+        <w:t>neighbouring</w:t>
+      </w:r>
+      <w:proofErr w:type="spellEnd"/>
+      <w:r>
+        <w:rPr>
+          <w:rFonts w:ascii="Calibri" w:hAnsi="Calibri" w:cs="Calibri"/>
+          <w:lang w:val="en-US"/>
+        </w:rPr>
+        <w:t xml:space="preserve"> frequencies, making the peak less clear and making it difficult to identify certain frequencies accurately.</w:t>
       </w:r>
     </w:p>
     <w:p>
@@ -2527,7 +3131,23 @@
           <w:rFonts w:ascii="Calibri" w:hAnsi="Calibri" w:cs="Calibri"/>
           <w:lang w:val="en-US"/>
         </w:rPr>
-        <w:t>Difficulty in detecting nearby frequencies: In an EEG signal, where you want to analyse narrow frequency bands (alpha, beta, etc.), spectral leakage can mask details and make it difficult to distinguish between nearby frequencies.</w:t>
+        <w:t xml:space="preserve">Difficulty in detecting nearby frequencies: In an EEG signal, where you want to </w:t>
+      </w:r>
+      <w:proofErr w:type="spellStart"/>
+      <w:r>
+        <w:rPr>
+          <w:rFonts w:ascii="Calibri" w:hAnsi="Calibri" w:cs="Calibri"/>
+          <w:lang w:val="en-US"/>
+        </w:rPr>
+        <w:t>analyse</w:t>
+      </w:r>
+      <w:proofErr w:type="spellEnd"/>
+      <w:r>
+        <w:rPr>
+          <w:rFonts w:ascii="Calibri" w:hAnsi="Calibri" w:cs="Calibri"/>
+          <w:lang w:val="en-US"/>
+        </w:rPr>
+        <w:t xml:space="preserve"> narrow frequency bands (alpha, beta, etc.), spectral leakage can mask details and make it difficult to distinguish between nearby frequencies.</w:t>
       </w:r>
     </w:p>
     <w:p>
@@ -2547,7 +3167,23 @@
           <w:rFonts w:ascii="Calibri" w:hAnsi="Calibri" w:cs="Calibri"/>
           <w:lang w:val="en-US"/>
         </w:rPr>
-        <w:t>Bias in the power spectral density (PSD): As the energy is not strictly localised on the expected frequencies, the measurement of the power of the frequency bands is less reliable.</w:t>
+        <w:t xml:space="preserve">Bias in the power spectral density (PSD): As the energy is not strictly </w:t>
+      </w:r>
+      <w:proofErr w:type="spellStart"/>
+      <w:r>
+        <w:rPr>
+          <w:rFonts w:ascii="Calibri" w:hAnsi="Calibri" w:cs="Calibri"/>
+          <w:lang w:val="en-US"/>
+        </w:rPr>
+        <w:t>localised</w:t>
+      </w:r>
+      <w:proofErr w:type="spellEnd"/>
+      <w:r>
+        <w:rPr>
+          <w:rFonts w:ascii="Calibri" w:hAnsi="Calibri" w:cs="Calibri"/>
+          <w:lang w:val="en-US"/>
+        </w:rPr>
+        <w:t xml:space="preserve"> on the expected frequencies, the measurement of the power of the frequency bands is less reliable.</w:t>
       </w:r>
     </w:p>
     <w:p>
@@ -2569,22 +3205,88 @@
           <w:rFonts w:ascii="Calibri" w:hAnsi="Calibri" w:cs="Calibri"/>
           <w:lang w:val="en-US"/>
         </w:rPr>
-        <w:t>For example, if I have a 1024 TF window, we'll multiply the data by a vector [0.08, 0.08,...,1,...,0.08) for Hamming windowing.</w:t>
-      </w:r>
-    </w:p>
-    <w:p>
-      <w:pPr>
-        <w:rPr>
-          <w:rFonts w:ascii="Calibri" w:hAnsi="Calibri" w:cs="Calibri"/>
-          <w:lang w:val="en-US"/>
-        </w:rPr>
-      </w:pPr>
-      <w:r>
-        <w:rPr>
-          <w:rFonts w:ascii="Calibri" w:hAnsi="Calibri" w:cs="Calibri"/>
-          <w:lang w:val="en-US"/>
-        </w:rPr>
-        <w:t>The disadvantage of applying a windowing function is that it artificially reduces the amplitude at the ends of the signal, which can reduce the power measured in the frequency bands, as it attenuates the signal in the time domain before moving on to the frequency domain. To compensate this lost of power, you can normalize the powers according to a reference period or a reference frequency as suggested in point 8.</w:t>
+        <w:t xml:space="preserve">For example, if I have a 1024 TF window, we'll multiply the data by a vector [0.08, </w:t>
+      </w:r>
+      <w:proofErr w:type="gramStart"/>
+      <w:r>
+        <w:rPr>
+          <w:rFonts w:ascii="Calibri" w:hAnsi="Calibri" w:cs="Calibri"/>
+          <w:lang w:val="en-US"/>
+        </w:rPr>
+        <w:t>0.08,...</w:t>
+      </w:r>
+      <w:proofErr w:type="gramEnd"/>
+      <w:r>
+        <w:rPr>
+          <w:rFonts w:ascii="Calibri" w:hAnsi="Calibri" w:cs="Calibri"/>
+          <w:lang w:val="en-US"/>
+        </w:rPr>
+        <w:t>,</w:t>
+      </w:r>
+      <w:proofErr w:type="gramStart"/>
+      <w:r>
+        <w:rPr>
+          <w:rFonts w:ascii="Calibri" w:hAnsi="Calibri" w:cs="Calibri"/>
+          <w:lang w:val="en-US"/>
+        </w:rPr>
+        <w:t>1,...</w:t>
+      </w:r>
+      <w:proofErr w:type="gramEnd"/>
+      <w:r>
+        <w:rPr>
+          <w:rFonts w:ascii="Calibri" w:hAnsi="Calibri" w:cs="Calibri"/>
+          <w:lang w:val="en-US"/>
+        </w:rPr>
+        <w:t>,0.08) for Hamming windowing.</w:t>
+      </w:r>
+    </w:p>
+    <w:p>
+      <w:pPr>
+        <w:rPr>
+          <w:rFonts w:ascii="Calibri" w:hAnsi="Calibri" w:cs="Calibri"/>
+          <w:lang w:val="en-US"/>
+        </w:rPr>
+      </w:pPr>
+      <w:r>
+        <w:rPr>
+          <w:rFonts w:ascii="Calibri" w:hAnsi="Calibri" w:cs="Calibri"/>
+          <w:lang w:val="en-US"/>
+        </w:rPr>
+        <w:t xml:space="preserve">The disadvantage of applying a windowing function is that it artificially reduces the amplitude at the ends of the signal, which can reduce the power measured in the frequency bands, as it attenuates the signal in the time domain before moving on to the frequency domain. To </w:t>
+      </w:r>
+      <w:proofErr w:type="gramStart"/>
+      <w:r>
+        <w:rPr>
+          <w:rFonts w:ascii="Calibri" w:hAnsi="Calibri" w:cs="Calibri"/>
+          <w:lang w:val="en-US"/>
+        </w:rPr>
+        <w:t>compensate</w:t>
+      </w:r>
+      <w:proofErr w:type="gramEnd"/>
+      <w:r>
+        <w:rPr>
+          <w:rFonts w:ascii="Calibri" w:hAnsi="Calibri" w:cs="Calibri"/>
+          <w:lang w:val="en-US"/>
+        </w:rPr>
+        <w:t xml:space="preserve"> this </w:t>
+      </w:r>
+      <w:proofErr w:type="spellStart"/>
+      <w:proofErr w:type="gramStart"/>
+      <w:r>
+        <w:rPr>
+          <w:rFonts w:ascii="Calibri" w:hAnsi="Calibri" w:cs="Calibri"/>
+          <w:lang w:val="en-US"/>
+        </w:rPr>
+        <w:t>lost</w:t>
+      </w:r>
+      <w:proofErr w:type="spellEnd"/>
+      <w:proofErr w:type="gramEnd"/>
+      <w:r>
+        <w:rPr>
+          <w:rFonts w:ascii="Calibri" w:hAnsi="Calibri" w:cs="Calibri"/>
+          <w:lang w:val="en-US"/>
+        </w:rPr>
+        <w:t xml:space="preserve"> of power, you can normalize the powers according to a reference period or a reference frequency as suggested in point 8.</w:t>
       </w:r>
     </w:p>
     <w:p>
@@ -2604,6 +3306,8 @@
           <w:lang w:val="en-US"/>
         </w:rPr>
       </w:pPr>
+      <w:proofErr w:type="spellStart"/>
+      <w:proofErr w:type="gramStart"/>
       <w:r>
         <w:rPr>
           <w:rFonts w:ascii="Calibri" w:hAnsi="Calibri" w:cs="Calibri"/>
@@ -2611,7 +3315,38 @@
           <w:bCs/>
           <w:lang w:val="en-US"/>
         </w:rPr>
-        <w:t>Sould I use a hamming or an hanning window function</w:t>
+        <w:t>Sould</w:t>
+      </w:r>
+      <w:proofErr w:type="spellEnd"/>
+      <w:proofErr w:type="gramEnd"/>
+      <w:r>
+        <w:rPr>
+          <w:rFonts w:ascii="Calibri" w:hAnsi="Calibri" w:cs="Calibri"/>
+          <w:b/>
+          <w:bCs/>
+          <w:lang w:val="en-US"/>
+        </w:rPr>
+        <w:t xml:space="preserve"> I use a hamming or an </w:t>
+      </w:r>
+      <w:proofErr w:type="spellStart"/>
+      <w:r>
+        <w:rPr>
+          <w:rFonts w:ascii="Calibri" w:hAnsi="Calibri" w:cs="Calibri"/>
+          <w:b/>
+          <w:bCs/>
+          <w:lang w:val="en-US"/>
+        </w:rPr>
+        <w:t>hanning</w:t>
+      </w:r>
+      <w:proofErr w:type="spellEnd"/>
+      <w:r>
+        <w:rPr>
+          <w:rFonts w:ascii="Calibri" w:hAnsi="Calibri" w:cs="Calibri"/>
+          <w:b/>
+          <w:bCs/>
+          <w:lang w:val="en-US"/>
+        </w:rPr>
+        <w:t xml:space="preserve"> window function</w:t>
       </w:r>
       <w:r>
         <w:rPr>
@@ -2665,8 +3400,28 @@
           <w:i/>
           <w:iCs/>
         </w:rPr>
-        <w:t>Hanning window:</w:t>
-      </w:r>
+        <w:t xml:space="preserve">Hanning </w:t>
+      </w:r>
+      <w:proofErr w:type="spellStart"/>
+      <w:proofErr w:type="gramStart"/>
+      <w:r>
+        <w:rPr>
+          <w:rFonts w:ascii="Calibri" w:hAnsi="Calibri" w:cs="Calibri"/>
+          <w:i/>
+          <w:iCs/>
+        </w:rPr>
+        <w:t>window</w:t>
+      </w:r>
+      <w:proofErr w:type="spellEnd"/>
+      <w:r>
+        <w:rPr>
+          <w:rFonts w:ascii="Calibri" w:hAnsi="Calibri" w:cs="Calibri"/>
+          <w:i/>
+          <w:iCs/>
+        </w:rPr>
+        <w:t>:</w:t>
+      </w:r>
+      <w:proofErr w:type="gramEnd"/>
     </w:p>
     <w:p>
       <w:pPr>
@@ -2723,7 +3478,23 @@
           <w:rFonts w:ascii="Calibri" w:hAnsi="Calibri" w:cs="Calibri"/>
           <w:lang w:val="en-US"/>
         </w:rPr>
-        <w:t>Hanning is particularly suitable if the aim is to isolate relatively narrow frequency bands accurately, such as the alpha and beta bands in EEG, while minimising leakage.</w:t>
+        <w:t xml:space="preserve">Hanning is particularly suitable if the aim is to isolate relatively narrow frequency bands accurately, such as the alpha and beta bands in EEG, while </w:t>
+      </w:r>
+      <w:proofErr w:type="spellStart"/>
+      <w:r>
+        <w:rPr>
+          <w:rFonts w:ascii="Calibri" w:hAnsi="Calibri" w:cs="Calibri"/>
+          <w:lang w:val="en-US"/>
+        </w:rPr>
+        <w:t>minimising</w:t>
+      </w:r>
+      <w:proofErr w:type="spellEnd"/>
+      <w:r>
+        <w:rPr>
+          <w:rFonts w:ascii="Calibri" w:hAnsi="Calibri" w:cs="Calibri"/>
+          <w:lang w:val="en-US"/>
+        </w:rPr>
+        <w:t xml:space="preserve"> leakage.</w:t>
       </w:r>
     </w:p>
     <w:p>
@@ -2744,8 +3515,28 @@
           <w:i/>
           <w:iCs/>
         </w:rPr>
-        <w:t>Hamming window:</w:t>
-      </w:r>
+        <w:t xml:space="preserve">Hamming </w:t>
+      </w:r>
+      <w:proofErr w:type="spellStart"/>
+      <w:proofErr w:type="gramStart"/>
+      <w:r>
+        <w:rPr>
+          <w:rFonts w:ascii="Calibri" w:hAnsi="Calibri" w:cs="Calibri"/>
+          <w:i/>
+          <w:iCs/>
+        </w:rPr>
+        <w:t>window</w:t>
+      </w:r>
+      <w:proofErr w:type="spellEnd"/>
+      <w:r>
+        <w:rPr>
+          <w:rFonts w:ascii="Calibri" w:hAnsi="Calibri" w:cs="Calibri"/>
+          <w:i/>
+          <w:iCs/>
+        </w:rPr>
+        <w:t>:</w:t>
+      </w:r>
+      <w:proofErr w:type="gramEnd"/>
     </w:p>
     <w:p>
       <w:pPr>
@@ -2763,7 +3554,23 @@
           <w:rFonts w:ascii="Calibri" w:hAnsi="Calibri" w:cs="Calibri"/>
           <w:lang w:val="en-US"/>
         </w:rPr>
-        <w:t>This has a slightly different shape and offers a better compromise between leakage attenuation and central lobe width, which improves frequency resolution (i.e. the ability to discriminate frequency peaks).</w:t>
+        <w:t xml:space="preserve">This has a slightly different shape and offers a better compromise between leakage attenuation and central lobe width, which improves frequency resolution (i.e. the ability to </w:t>
+      </w:r>
+      <w:proofErr w:type="gramStart"/>
+      <w:r>
+        <w:rPr>
+          <w:rFonts w:ascii="Calibri" w:hAnsi="Calibri" w:cs="Calibri"/>
+          <w:lang w:val="en-US"/>
+        </w:rPr>
+        <w:t>discriminate</w:t>
+      </w:r>
+      <w:proofErr w:type="gramEnd"/>
+      <w:r>
+        <w:rPr>
+          <w:rFonts w:ascii="Calibri" w:hAnsi="Calibri" w:cs="Calibri"/>
+          <w:lang w:val="en-US"/>
+        </w:rPr>
+        <w:t xml:space="preserve"> frequency peaks).</w:t>
       </w:r>
     </w:p>
     <w:p>
@@ -2863,7 +3670,23 @@
           <w:rFonts w:ascii="Calibri" w:hAnsi="Calibri" w:cs="Calibri"/>
           <w:lang w:val="en-US"/>
         </w:rPr>
-        <w:t>: preferred if you are looking to minimise spectral leakage, particularly for narrow bands.</w:t>
+        <w:t xml:space="preserve">: preferred if you are looking to </w:t>
+      </w:r>
+      <w:proofErr w:type="spellStart"/>
+      <w:r>
+        <w:rPr>
+          <w:rFonts w:ascii="Calibri" w:hAnsi="Calibri" w:cs="Calibri"/>
+          <w:lang w:val="en-US"/>
+        </w:rPr>
+        <w:t>minimise</w:t>
+      </w:r>
+      <w:proofErr w:type="spellEnd"/>
+      <w:r>
+        <w:rPr>
+          <w:rFonts w:ascii="Calibri" w:hAnsi="Calibri" w:cs="Calibri"/>
+          <w:lang w:val="en-US"/>
+        </w:rPr>
+        <w:t xml:space="preserve"> spectral leakage, particularly for narrow bands.</w:t>
       </w:r>
     </w:p>
     <w:p>
@@ -3201,12 +4024,37 @@
           <w:lang w:val="en-US"/>
         </w:rPr>
       </w:pPr>
-      <w:r>
-        <w:rPr>
-          <w:rFonts w:ascii="Calibri" w:hAnsi="Calibri" w:cs="Calibri"/>
-          <w:lang w:val="en-US"/>
-        </w:rPr>
-        <w:t>LogPower = 10 .* log</w:t>
+      <w:proofErr w:type="spellStart"/>
+      <w:r>
+        <w:rPr>
+          <w:rFonts w:ascii="Calibri" w:hAnsi="Calibri" w:cs="Calibri"/>
+          <w:lang w:val="en-US"/>
+        </w:rPr>
+        <w:t>LogPower</w:t>
+      </w:r>
+      <w:proofErr w:type="spellEnd"/>
+      <w:r>
+        <w:rPr>
+          <w:rFonts w:ascii="Calibri" w:hAnsi="Calibri" w:cs="Calibri"/>
+          <w:lang w:val="en-US"/>
+        </w:rPr>
+        <w:t xml:space="preserve"> = </w:t>
+      </w:r>
+      <w:proofErr w:type="gramStart"/>
+      <w:r>
+        <w:rPr>
+          <w:rFonts w:ascii="Calibri" w:hAnsi="Calibri" w:cs="Calibri"/>
+          <w:lang w:val="en-US"/>
+        </w:rPr>
+        <w:t>10 .</w:t>
+      </w:r>
+      <w:proofErr w:type="gramEnd"/>
+      <w:r>
+        <w:rPr>
+          <w:rFonts w:ascii="Calibri" w:hAnsi="Calibri" w:cs="Calibri"/>
+          <w:lang w:val="en-US"/>
+        </w:rPr>
+        <w:t>* log</w:t>
       </w:r>
       <w:r>
         <w:rPr>
@@ -3221,8 +4069,33 @@
           <w:rFonts w:ascii="Calibri" w:hAnsi="Calibri" w:cs="Calibri"/>
           <w:lang w:val="en-US"/>
         </w:rPr>
-        <w:t>(Power ./ mean power);</w:t>
-      </w:r>
+        <w:t>(</w:t>
+      </w:r>
+      <w:proofErr w:type="gramStart"/>
+      <w:r>
+        <w:rPr>
+          <w:rFonts w:ascii="Calibri" w:hAnsi="Calibri" w:cs="Calibri"/>
+          <w:lang w:val="en-US"/>
+        </w:rPr>
+        <w:t>Power .</w:t>
+      </w:r>
+      <w:proofErr w:type="gramEnd"/>
+      <w:r>
+        <w:rPr>
+          <w:rFonts w:ascii="Calibri" w:hAnsi="Calibri" w:cs="Calibri"/>
+          <w:lang w:val="en-US"/>
+        </w:rPr>
+        <w:t>/ mean power</w:t>
+      </w:r>
+      <w:proofErr w:type="gramStart"/>
+      <w:r>
+        <w:rPr>
+          <w:rFonts w:ascii="Calibri" w:hAnsi="Calibri" w:cs="Calibri"/>
+          <w:lang w:val="en-US"/>
+        </w:rPr>
+        <w:t>);</w:t>
+      </w:r>
+      <w:proofErr w:type="gramEnd"/>
     </w:p>
     <w:p>
       <w:pPr>
@@ -3299,8 +4172,9 @@
           <w:bCs/>
           <w:lang w:val="en-US"/>
         </w:rPr>
-        <w:t xml:space="preserve">How can I display my result .freq file in </w:t>
-      </w:r>
+        <w:t>How can I display my result .</w:t>
+      </w:r>
+      <w:proofErr w:type="spellStart"/>
       <w:r>
         <w:rPr>
           <w:rFonts w:ascii="Calibri" w:hAnsi="Calibri" w:cs="Calibri"/>
@@ -3308,7 +4182,37 @@
           <w:bCs/>
           <w:lang w:val="en-US"/>
         </w:rPr>
-        <w:t>Cartool?</w:t>
+        <w:t>freq</w:t>
+      </w:r>
+      <w:proofErr w:type="spellEnd"/>
+      <w:r>
+        <w:rPr>
+          <w:rFonts w:ascii="Calibri" w:hAnsi="Calibri" w:cs="Calibri"/>
+          <w:b/>
+          <w:bCs/>
+          <w:lang w:val="en-US"/>
+        </w:rPr>
+        <w:t xml:space="preserve"> file in </w:t>
+      </w:r>
+      <w:proofErr w:type="spellStart"/>
+      <w:r>
+        <w:rPr>
+          <w:rFonts w:ascii="Calibri" w:hAnsi="Calibri" w:cs="Calibri"/>
+          <w:b/>
+          <w:bCs/>
+          <w:lang w:val="en-US"/>
+        </w:rPr>
+        <w:t>Cartool</w:t>
+      </w:r>
+      <w:proofErr w:type="spellEnd"/>
+      <w:r>
+        <w:rPr>
+          <w:rFonts w:ascii="Calibri" w:hAnsi="Calibri" w:cs="Calibri"/>
+          <w:b/>
+          <w:bCs/>
+          <w:lang w:val="en-US"/>
+        </w:rPr>
+        <w:t>?</w:t>
       </w:r>
       <w:r>
         <w:rPr>
@@ -3396,14 +4300,78 @@
           <w:rFonts w:ascii="Calibri" w:hAnsi="Calibri" w:cs="Calibri"/>
           <w:lang w:val="en-US"/>
         </w:rPr>
-        <w:t xml:space="preserve">By default, Cartool show you the result for a specific frequency (in this example 16Hz) with the power for each time windows (horizontal dimension) and the electrodes (vercital dimension). </w:t>
-      </w:r>
-      <w:r>
-        <w:rPr>
-          <w:rFonts w:ascii="Calibri" w:hAnsi="Calibri" w:cs="Calibri"/>
-          <w:lang w:val="en-US"/>
-        </w:rPr>
-        <w:t xml:space="preserve">To change the frequency to displayed, use the button : </w:t>
+        <w:t xml:space="preserve">By default, </w:t>
+      </w:r>
+      <w:proofErr w:type="spellStart"/>
+      <w:r>
+        <w:rPr>
+          <w:rFonts w:ascii="Calibri" w:hAnsi="Calibri" w:cs="Calibri"/>
+          <w:lang w:val="en-US"/>
+        </w:rPr>
+        <w:t>Cartool</w:t>
+      </w:r>
+      <w:proofErr w:type="spellEnd"/>
+      <w:r>
+        <w:rPr>
+          <w:rFonts w:ascii="Calibri" w:hAnsi="Calibri" w:cs="Calibri"/>
+          <w:lang w:val="en-US"/>
+        </w:rPr>
+        <w:t xml:space="preserve"> show you the result for a specific frequency (in this example 16Hz) with the power for each time windows (horizontal dimension) and the electrodes (</w:t>
+      </w:r>
+      <w:proofErr w:type="spellStart"/>
+      <w:r>
+        <w:rPr>
+          <w:rFonts w:ascii="Calibri" w:hAnsi="Calibri" w:cs="Calibri"/>
+          <w:lang w:val="en-US"/>
+        </w:rPr>
+        <w:t>vercital</w:t>
+      </w:r>
+      <w:proofErr w:type="spellEnd"/>
+      <w:r>
+        <w:rPr>
+          <w:rFonts w:ascii="Calibri" w:hAnsi="Calibri" w:cs="Calibri"/>
+          <w:lang w:val="en-US"/>
+        </w:rPr>
+        <w:t xml:space="preserve"> dimension). </w:t>
+      </w:r>
+      <w:r>
+        <w:rPr>
+          <w:rFonts w:ascii="Calibri" w:hAnsi="Calibri" w:cs="Calibri"/>
+          <w:lang w:val="en-US"/>
+        </w:rPr>
+        <w:t xml:space="preserve">To change the frequency </w:t>
+      </w:r>
+      <w:proofErr w:type="gramStart"/>
+      <w:r>
+        <w:rPr>
+          <w:rFonts w:ascii="Calibri" w:hAnsi="Calibri" w:cs="Calibri"/>
+          <w:lang w:val="en-US"/>
+        </w:rPr>
+        <w:t>to displayed</w:t>
+      </w:r>
+      <w:proofErr w:type="gramEnd"/>
+      <w:r>
+        <w:rPr>
+          <w:rFonts w:ascii="Calibri" w:hAnsi="Calibri" w:cs="Calibri"/>
+          <w:lang w:val="en-US"/>
+        </w:rPr>
+        <w:t xml:space="preserve">, use the </w:t>
+      </w:r>
+      <w:proofErr w:type="gramStart"/>
+      <w:r>
+        <w:rPr>
+          <w:rFonts w:ascii="Calibri" w:hAnsi="Calibri" w:cs="Calibri"/>
+          <w:lang w:val="en-US"/>
+        </w:rPr>
+        <w:t>button :</w:t>
+      </w:r>
+      <w:proofErr w:type="gramEnd"/>
+      <w:r>
+        <w:rPr>
+          <w:rFonts w:ascii="Calibri" w:hAnsi="Calibri" w:cs="Calibri"/>
+          <w:lang w:val="en-US"/>
+        </w:rPr>
+        <w:t xml:space="preserve"> </w:t>
       </w:r>
       <w:r>
         <w:rPr>
@@ -3467,8 +4435,17 @@
           <w:rFonts w:ascii="Calibri" w:hAnsi="Calibri" w:cs="Calibri"/>
           <w:lang w:val="en-US"/>
         </w:rPr>
-        <w:t>In case of ‘Per file (averaged time windows)’ option :</w:t>
-      </w:r>
+        <w:t xml:space="preserve">In case of ‘Per file (averaged time windows)’ </w:t>
+      </w:r>
+      <w:proofErr w:type="gramStart"/>
+      <w:r>
+        <w:rPr>
+          <w:rFonts w:ascii="Calibri" w:hAnsi="Calibri" w:cs="Calibri"/>
+          <w:lang w:val="en-US"/>
+        </w:rPr>
+        <w:t>option :</w:t>
+      </w:r>
+      <w:proofErr w:type="gramEnd"/>
     </w:p>
     <w:p>
       <w:pPr>
@@ -3532,7 +4509,23 @@
           <w:rFonts w:ascii="Calibri" w:hAnsi="Calibri" w:cs="Calibri"/>
           <w:lang w:val="en-US"/>
         </w:rPr>
-        <w:t>By default, Cartool show you the Power spectrum view. Each line is the average power across each time window for each electrode. The horizontal axis is the different frequency of the spectrum</w:t>
+        <w:t xml:space="preserve">By default, </w:t>
+      </w:r>
+      <w:proofErr w:type="spellStart"/>
+      <w:r>
+        <w:rPr>
+          <w:rFonts w:ascii="Calibri" w:hAnsi="Calibri" w:cs="Calibri"/>
+          <w:lang w:val="en-US"/>
+        </w:rPr>
+        <w:t>Cartool</w:t>
+      </w:r>
+      <w:proofErr w:type="spellEnd"/>
+      <w:r>
+        <w:rPr>
+          <w:rFonts w:ascii="Calibri" w:hAnsi="Calibri" w:cs="Calibri"/>
+          <w:lang w:val="en-US"/>
+        </w:rPr>
+        <w:t xml:space="preserve"> show you the Power spectrum view. Each line is the average power across each time window for each electrode. The horizontal axis is the different frequency of the spectrum</w:t>
       </w:r>
       <w:r>
         <w:rPr>
@@ -3554,7 +4547,23 @@
           <w:rFonts w:ascii="Calibri" w:hAnsi="Calibri" w:cs="Calibri"/>
           <w:lang w:val="en-US"/>
         </w:rPr>
-        <w:t xml:space="preserve">In both cases, you can associate the file with a coordinate file to have an estimation of the topography (in a lm file) as usual. The manipulation of the power trace is also similar as in EEG file display. </w:t>
+        <w:t xml:space="preserve">In both cases, you can associate the file with a coordinate file to have an estimation of the topography (in a </w:t>
+      </w:r>
+      <w:proofErr w:type="spellStart"/>
+      <w:r>
+        <w:rPr>
+          <w:rFonts w:ascii="Calibri" w:hAnsi="Calibri" w:cs="Calibri"/>
+          <w:lang w:val="en-US"/>
+        </w:rPr>
+        <w:t>lm</w:t>
+      </w:r>
+      <w:proofErr w:type="spellEnd"/>
+      <w:r>
+        <w:rPr>
+          <w:rFonts w:ascii="Calibri" w:hAnsi="Calibri" w:cs="Calibri"/>
+          <w:lang w:val="en-US"/>
+        </w:rPr>
+        <w:t xml:space="preserve"> file) as usual. The manipulation of the power trace is also similar as in EEG file display. </w:t>
       </w:r>
     </w:p>
     <w:p>
@@ -3581,22 +4590,58 @@
           <w:bCs/>
           <w:lang w:val="en-US"/>
         </w:rPr>
-        <w:t xml:space="preserve">How can I interpret the PSD output .mat file ? </w:t>
-      </w:r>
-    </w:p>
-    <w:p>
-      <w:pPr>
-        <w:rPr>
-          <w:rFonts w:ascii="Calibri" w:hAnsi="Calibri" w:cs="Calibri"/>
-          <w:lang w:val="en-US"/>
-        </w:rPr>
-      </w:pPr>
-      <w:r>
-        <w:rPr>
-          <w:rFonts w:ascii="Calibri" w:hAnsi="Calibri" w:cs="Calibri"/>
-          <w:lang w:val="en-US"/>
-        </w:rPr>
-        <w:t xml:space="preserve">The output PSD .mat files don’t have header to help you to understand how the data are organized. However, you can interpret the organization by looking at the matrix dimensions. Here is the organization of the output matrixes: </w:t>
+        <w:t xml:space="preserve">How can I interpret the PSD output .mat </w:t>
+      </w:r>
+      <w:proofErr w:type="gramStart"/>
+      <w:r>
+        <w:rPr>
+          <w:rFonts w:ascii="Calibri" w:hAnsi="Calibri" w:cs="Calibri"/>
+          <w:b/>
+          <w:bCs/>
+          <w:lang w:val="en-US"/>
+        </w:rPr>
+        <w:t>file ?</w:t>
+      </w:r>
+      <w:proofErr w:type="gramEnd"/>
+      <w:r>
+        <w:rPr>
+          <w:rFonts w:ascii="Calibri" w:hAnsi="Calibri" w:cs="Calibri"/>
+          <w:b/>
+          <w:bCs/>
+          <w:lang w:val="en-US"/>
+        </w:rPr>
+        <w:t xml:space="preserve"> </w:t>
+      </w:r>
+    </w:p>
+    <w:p>
+      <w:pPr>
+        <w:rPr>
+          <w:rFonts w:ascii="Calibri" w:hAnsi="Calibri" w:cs="Calibri"/>
+          <w:lang w:val="en-US"/>
+        </w:rPr>
+      </w:pPr>
+      <w:r>
+        <w:rPr>
+          <w:rFonts w:ascii="Calibri" w:hAnsi="Calibri" w:cs="Calibri"/>
+          <w:lang w:val="en-US"/>
+        </w:rPr>
+        <w:t>The output PSD .</w:t>
+      </w:r>
+      <w:proofErr w:type="gramStart"/>
+      <w:r>
+        <w:rPr>
+          <w:rFonts w:ascii="Calibri" w:hAnsi="Calibri" w:cs="Calibri"/>
+          <w:lang w:val="en-US"/>
+        </w:rPr>
+        <w:t>mat</w:t>
+      </w:r>
+      <w:proofErr w:type="gramEnd"/>
+      <w:r>
+        <w:rPr>
+          <w:rFonts w:ascii="Calibri" w:hAnsi="Calibri" w:cs="Calibri"/>
+          <w:lang w:val="en-US"/>
+        </w:rPr>
+        <w:t xml:space="preserve"> files don’t have header to help you to understand how the data are organized. However, you can interpret the organization by looking at the matrix dimensions. Here is the organization of the output matrixes: </w:t>
       </w:r>
     </w:p>
     <w:p>
@@ -3620,12 +4665,37 @@
         </w:rPr>
         <w:t>PSD whole range (averaged time windows</w:t>
       </w:r>
-      <w:r>
-        <w:rPr>
-          <w:rFonts w:ascii="Calibri" w:hAnsi="Calibri" w:cs="Calibri"/>
-          <w:lang w:val="en-US"/>
-        </w:rPr>
-        <w:t xml:space="preserve">) : # of frequency bins </w:t>
+      <w:proofErr w:type="gramStart"/>
+      <w:r>
+        <w:rPr>
+          <w:rFonts w:ascii="Calibri" w:hAnsi="Calibri" w:cs="Calibri"/>
+          <w:lang w:val="en-US"/>
+        </w:rPr>
+        <w:t>) :</w:t>
+      </w:r>
+      <w:proofErr w:type="gramEnd"/>
+      <w:r>
+        <w:rPr>
+          <w:rFonts w:ascii="Calibri" w:hAnsi="Calibri" w:cs="Calibri"/>
+          <w:lang w:val="en-US"/>
+        </w:rPr>
+        <w:t xml:space="preserve"> </w:t>
+      </w:r>
+      <w:proofErr w:type="gramStart"/>
+      <w:r>
+        <w:rPr>
+          <w:rFonts w:ascii="Calibri" w:hAnsi="Calibri" w:cs="Calibri"/>
+          <w:lang w:val="en-US"/>
+        </w:rPr>
+        <w:t># of frequency</w:t>
+      </w:r>
+      <w:proofErr w:type="gramEnd"/>
+      <w:r>
+        <w:rPr>
+          <w:rFonts w:ascii="Calibri" w:hAnsi="Calibri" w:cs="Calibri"/>
+          <w:lang w:val="en-US"/>
+        </w:rPr>
+        <w:t xml:space="preserve"> bins </w:t>
       </w:r>
       <w:r>
         <w:rPr>
@@ -3683,12 +4753,21 @@
         </w:rPr>
         <w:t xml:space="preserve"> time windows</w:t>
       </w:r>
-      <w:r>
-        <w:rPr>
-          <w:rFonts w:ascii="Calibri" w:hAnsi="Calibri" w:cs="Calibri"/>
-          <w:lang w:val="en-US"/>
-        </w:rPr>
-        <w:t xml:space="preserve">) : </w:t>
+      <w:proofErr w:type="gramStart"/>
+      <w:r>
+        <w:rPr>
+          <w:rFonts w:ascii="Calibri" w:hAnsi="Calibri" w:cs="Calibri"/>
+          <w:lang w:val="en-US"/>
+        </w:rPr>
+        <w:t>) :</w:t>
+      </w:r>
+      <w:proofErr w:type="gramEnd"/>
+      <w:r>
+        <w:rPr>
+          <w:rFonts w:ascii="Calibri" w:hAnsi="Calibri" w:cs="Calibri"/>
+          <w:lang w:val="en-US"/>
+        </w:rPr>
+        <w:t xml:space="preserve"> </w:t>
       </w:r>
       <w:r>
         <w:rPr>
@@ -3769,12 +4848,21 @@
         </w:rPr>
         <w:t xml:space="preserve"> (averaged time windows</w:t>
       </w:r>
-      <w:r>
-        <w:rPr>
-          <w:rFonts w:ascii="Calibri" w:hAnsi="Calibri" w:cs="Calibri"/>
-          <w:lang w:val="en-US"/>
-        </w:rPr>
-        <w:t xml:space="preserve">) : # of frequency bands </w:t>
+      <w:proofErr w:type="gramStart"/>
+      <w:r>
+        <w:rPr>
+          <w:rFonts w:ascii="Calibri" w:hAnsi="Calibri" w:cs="Calibri"/>
+          <w:lang w:val="en-US"/>
+        </w:rPr>
+        <w:t>) :</w:t>
+      </w:r>
+      <w:proofErr w:type="gramEnd"/>
+      <w:r>
+        <w:rPr>
+          <w:rFonts w:ascii="Calibri" w:hAnsi="Calibri" w:cs="Calibri"/>
+          <w:lang w:val="en-US"/>
+        </w:rPr>
+        <w:t xml:space="preserve"> # of frequency bands </w:t>
       </w:r>
       <w:r>
         <w:rPr>
@@ -3814,12 +4902,21 @@
         </w:rPr>
         <w:t>PSD Frequency bands (separate time windows</w:t>
       </w:r>
-      <w:r>
-        <w:rPr>
-          <w:rFonts w:ascii="Calibri" w:hAnsi="Calibri" w:cs="Calibri"/>
-          <w:lang w:val="en-US"/>
-        </w:rPr>
-        <w:t xml:space="preserve">) : </w:t>
+      <w:proofErr w:type="gramStart"/>
+      <w:r>
+        <w:rPr>
+          <w:rFonts w:ascii="Calibri" w:hAnsi="Calibri" w:cs="Calibri"/>
+          <w:lang w:val="en-US"/>
+        </w:rPr>
+        <w:t>) :</w:t>
+      </w:r>
+      <w:proofErr w:type="gramEnd"/>
+      <w:r>
+        <w:rPr>
+          <w:rFonts w:ascii="Calibri" w:hAnsi="Calibri" w:cs="Calibri"/>
+          <w:lang w:val="en-US"/>
+        </w:rPr>
+        <w:t xml:space="preserve"> </w:t>
       </w:r>
       <w:r>
         <w:rPr>
@@ -3900,8 +4997,25 @@
           <w:rFonts w:ascii="Calibri" w:hAnsi="Calibri" w:cs="Calibri"/>
           <w:lang w:val="en-US"/>
         </w:rPr>
-        <w:t xml:space="preserve">Yes, you can specify with which electrodes you want to work. You have to specify them before to open the </w:t>
-      </w:r>
+        <w:t xml:space="preserve">Yes, you can specify with which electrodes you want to work. You </w:t>
+      </w:r>
+      <w:proofErr w:type="gramStart"/>
+      <w:r>
+        <w:rPr>
+          <w:rFonts w:ascii="Calibri" w:hAnsi="Calibri" w:cs="Calibri"/>
+          <w:lang w:val="en-US"/>
+        </w:rPr>
+        <w:t>have to</w:t>
+      </w:r>
+      <w:proofErr w:type="gramEnd"/>
+      <w:r>
+        <w:rPr>
+          <w:rFonts w:ascii="Calibri" w:hAnsi="Calibri" w:cs="Calibri"/>
+          <w:lang w:val="en-US"/>
+        </w:rPr>
+        <w:t xml:space="preserve"> specify them before to open the </w:t>
+      </w:r>
+      <w:proofErr w:type="spellStart"/>
       <w:r>
         <w:rPr>
           <w:rFonts w:ascii="Calibri" w:hAnsi="Calibri" w:cs="Calibri"/>
@@ -3909,15 +5023,9 @@
           <w:iCs/>
           <w:lang w:val="en-US"/>
         </w:rPr>
-        <w:t>Frequencying module</w:t>
-      </w:r>
-      <w:r>
-        <w:rPr>
-          <w:rFonts w:ascii="Calibri" w:hAnsi="Calibri" w:cs="Calibri"/>
-          <w:lang w:val="en-US"/>
-        </w:rPr>
-        <w:t xml:space="preserve">. In the main EEGpal windows, press on the button </w:t>
-      </w:r>
+        <w:t>Frequencying</w:t>
+      </w:r>
+      <w:proofErr w:type="spellEnd"/>
       <w:r>
         <w:rPr>
           <w:rFonts w:ascii="Calibri" w:hAnsi="Calibri" w:cs="Calibri"/>
@@ -3925,14 +5033,38 @@
           <w:iCs/>
           <w:lang w:val="en-US"/>
         </w:rPr>
-        <w:t>Electrode Setting</w:t>
-      </w:r>
-      <w:r>
-        <w:rPr>
-          <w:rFonts w:ascii="Calibri" w:hAnsi="Calibri" w:cs="Calibri"/>
-          <w:lang w:val="en-US"/>
-        </w:rPr>
-        <w:t xml:space="preserve">. After selecting of the appropriate ‘Electrode Setting file’, select the electrodes that you want to include in the analysis (column </w:t>
+        <w:t xml:space="preserve"> module</w:t>
+      </w:r>
+      <w:r>
+        <w:rPr>
+          <w:rFonts w:ascii="Calibri" w:hAnsi="Calibri" w:cs="Calibri"/>
+          <w:lang w:val="en-US"/>
+        </w:rPr>
+        <w:t xml:space="preserve">. In the main </w:t>
+      </w:r>
+      <w:proofErr w:type="spellStart"/>
+      <w:r>
+        <w:rPr>
+          <w:rFonts w:ascii="Calibri" w:hAnsi="Calibri" w:cs="Calibri"/>
+          <w:lang w:val="en-US"/>
+        </w:rPr>
+        <w:t>EEGpal</w:t>
+      </w:r>
+      <w:proofErr w:type="spellEnd"/>
+      <w:r>
+        <w:rPr>
+          <w:rFonts w:ascii="Calibri" w:hAnsi="Calibri" w:cs="Calibri"/>
+          <w:lang w:val="en-US"/>
+        </w:rPr>
+        <w:t xml:space="preserve"> windows, press on the </w:t>
+      </w:r>
+      <w:proofErr w:type="gramStart"/>
+      <w:r>
+        <w:rPr>
+          <w:rFonts w:ascii="Calibri" w:hAnsi="Calibri" w:cs="Calibri"/>
+          <w:lang w:val="en-US"/>
+        </w:rPr>
+        <w:t xml:space="preserve">button </w:t>
       </w:r>
       <w:r>
         <w:rPr>
@@ -3941,14 +5073,31 @@
           <w:iCs/>
           <w:lang w:val="en-US"/>
         </w:rPr>
-        <w:t>include</w:t>
-      </w:r>
-      <w:r>
-        <w:rPr>
-          <w:rFonts w:ascii="Calibri" w:hAnsi="Calibri" w:cs="Calibri"/>
-          <w:lang w:val="en-US"/>
-        </w:rPr>
-        <w:t xml:space="preserve">) and press on Done button. Then when you will open the </w:t>
+        <w:t>Electrode Setting</w:t>
+      </w:r>
+      <w:proofErr w:type="gramEnd"/>
+      <w:r>
+        <w:rPr>
+          <w:rFonts w:ascii="Calibri" w:hAnsi="Calibri" w:cs="Calibri"/>
+          <w:lang w:val="en-US"/>
+        </w:rPr>
+        <w:t xml:space="preserve">. After </w:t>
+      </w:r>
+      <w:proofErr w:type="gramStart"/>
+      <w:r>
+        <w:rPr>
+          <w:rFonts w:ascii="Calibri" w:hAnsi="Calibri" w:cs="Calibri"/>
+          <w:lang w:val="en-US"/>
+        </w:rPr>
+        <w:t>selecting of</w:t>
+      </w:r>
+      <w:proofErr w:type="gramEnd"/>
+      <w:r>
+        <w:rPr>
+          <w:rFonts w:ascii="Calibri" w:hAnsi="Calibri" w:cs="Calibri"/>
+          <w:lang w:val="en-US"/>
+        </w:rPr>
+        <w:t xml:space="preserve"> the appropriate ‘Electrode Setting file’, select the electrodes that you want to include in the analysis (column </w:t>
       </w:r>
       <w:r>
         <w:rPr>
@@ -3957,7 +5106,50 @@
           <w:iCs/>
           <w:lang w:val="en-US"/>
         </w:rPr>
-        <w:t xml:space="preserve">Frequencying module </w:t>
+        <w:t>include</w:t>
+      </w:r>
+      <w:r>
+        <w:rPr>
+          <w:rFonts w:ascii="Calibri" w:hAnsi="Calibri" w:cs="Calibri"/>
+          <w:lang w:val="en-US"/>
+        </w:rPr>
+        <w:t xml:space="preserve">) and press on Done button. Then when </w:t>
+      </w:r>
+      <w:proofErr w:type="gramStart"/>
+      <w:r>
+        <w:rPr>
+          <w:rFonts w:ascii="Calibri" w:hAnsi="Calibri" w:cs="Calibri"/>
+          <w:lang w:val="en-US"/>
+        </w:rPr>
+        <w:t>you will</w:t>
+      </w:r>
+      <w:proofErr w:type="gramEnd"/>
+      <w:r>
+        <w:rPr>
+          <w:rFonts w:ascii="Calibri" w:hAnsi="Calibri" w:cs="Calibri"/>
+          <w:lang w:val="en-US"/>
+        </w:rPr>
+        <w:t xml:space="preserve"> open the </w:t>
+      </w:r>
+      <w:proofErr w:type="spellStart"/>
+      <w:r>
+        <w:rPr>
+          <w:rFonts w:ascii="Calibri" w:hAnsi="Calibri" w:cs="Calibri"/>
+          <w:i/>
+          <w:iCs/>
+          <w:lang w:val="en-US"/>
+        </w:rPr>
+        <w:t>Frequencying</w:t>
+      </w:r>
+      <w:proofErr w:type="spellEnd"/>
+      <w:r>
+        <w:rPr>
+          <w:rFonts w:ascii="Calibri" w:hAnsi="Calibri" w:cs="Calibri"/>
+          <w:i/>
+          <w:iCs/>
+          <w:lang w:val="en-US"/>
+        </w:rPr>
+        <w:t xml:space="preserve"> module </w:t>
       </w:r>
       <w:r>
         <w:rPr>
@@ -3992,8 +5184,9 @@
           <w:lang w:val="en-US"/>
         </w:rPr>
         <w:lastRenderedPageBreak/>
-        <w:t>Is there a difference of results between ‘Fast Fourier Tansform (FFT)</w:t>
-      </w:r>
+        <w:t xml:space="preserve">Is there a difference of results between ‘Fast Fourier </w:t>
+      </w:r>
+      <w:proofErr w:type="spellStart"/>
       <w:r>
         <w:rPr>
           <w:rFonts w:ascii="Calibri" w:hAnsi="Calibri" w:cs="Calibri"/>
@@ -4001,8 +5194,9 @@
           <w:bCs/>
           <w:lang w:val="en-US"/>
         </w:rPr>
-        <w:t>’</w:t>
-      </w:r>
+        <w:t>Tansform</w:t>
+      </w:r>
+      <w:proofErr w:type="spellEnd"/>
       <w:r>
         <w:rPr>
           <w:rFonts w:ascii="Calibri" w:hAnsi="Calibri" w:cs="Calibri"/>
@@ -4010,44 +5204,141 @@
           <w:bCs/>
           <w:lang w:val="en-US"/>
         </w:rPr>
-        <w:t xml:space="preserve"> and ‘eeglab (FFT)’? </w:t>
-      </w:r>
-    </w:p>
-    <w:p>
-      <w:pPr>
-        <w:rPr>
-          <w:rFonts w:ascii="Calibri" w:hAnsi="Calibri" w:cs="Calibri"/>
-          <w:lang w:val="en-US"/>
-        </w:rPr>
-      </w:pPr>
-      <w:r>
-        <w:rPr>
-          <w:rFonts w:ascii="Calibri" w:hAnsi="Calibri" w:cs="Calibri"/>
-          <w:lang w:val="en-US"/>
-        </w:rPr>
-        <w:t xml:space="preserve">The two options are similar </w:t>
-      </w:r>
-      <w:r>
-        <w:rPr>
-          <w:rFonts w:ascii="Calibri" w:hAnsi="Calibri" w:cs="Calibri"/>
-          <w:lang w:val="en-US"/>
-        </w:rPr>
-        <w:t>according to the change of power between the frequencies (see plot below). However, there is a difference of scaling in the power value even if both results have the same unit (µV</w:t>
-      </w:r>
-      <w:r>
-        <w:rPr>
-          <w:rFonts w:ascii="Calibri" w:hAnsi="Calibri" w:cs="Calibri"/>
-          <w:vertAlign w:val="superscript"/>
-          <w:lang w:val="en-US"/>
-        </w:rPr>
-        <w:t>2</w:t>
-      </w:r>
-      <w:r>
-        <w:rPr>
-          <w:rFonts w:ascii="Calibri" w:hAnsi="Calibri" w:cs="Calibri"/>
-          <w:lang w:val="en-US"/>
-        </w:rPr>
-        <w:t xml:space="preserve">/Hz). </w:t>
+        <w:t xml:space="preserve"> (FFT)</w:t>
+      </w:r>
+      <w:r>
+        <w:rPr>
+          <w:rFonts w:ascii="Calibri" w:hAnsi="Calibri" w:cs="Calibri"/>
+          <w:b/>
+          <w:bCs/>
+          <w:lang w:val="en-US"/>
+        </w:rPr>
+        <w:t>’</w:t>
+      </w:r>
+      <w:r>
+        <w:rPr>
+          <w:rFonts w:ascii="Calibri" w:hAnsi="Calibri" w:cs="Calibri"/>
+          <w:b/>
+          <w:bCs/>
+          <w:lang w:val="en-US"/>
+        </w:rPr>
+        <w:t xml:space="preserve"> and ‘</w:t>
+      </w:r>
+      <w:proofErr w:type="spellStart"/>
+      <w:r>
+        <w:rPr>
+          <w:rFonts w:ascii="Calibri" w:hAnsi="Calibri" w:cs="Calibri"/>
+          <w:b/>
+          <w:bCs/>
+          <w:lang w:val="en-US"/>
+        </w:rPr>
+        <w:t>eeglab</w:t>
+      </w:r>
+      <w:proofErr w:type="spellEnd"/>
+      <w:r>
+        <w:rPr>
+          <w:rFonts w:ascii="Calibri" w:hAnsi="Calibri" w:cs="Calibri"/>
+          <w:b/>
+          <w:bCs/>
+          <w:lang w:val="en-US"/>
+        </w:rPr>
+        <w:t xml:space="preserve"> (FFT)’? </w:t>
+      </w:r>
+    </w:p>
+    <w:p>
+      <w:pPr>
+        <w:rPr>
+          <w:rFonts w:ascii="Calibri" w:hAnsi="Calibri" w:cs="Calibri"/>
+          <w:lang w:val="en-US"/>
+        </w:rPr>
+      </w:pPr>
+      <w:r>
+        <w:rPr>
+          <w:rFonts w:ascii="Calibri" w:hAnsi="Calibri" w:cs="Calibri"/>
+          <w:lang w:val="en-US"/>
+        </w:rPr>
+        <w:t>Both methods produce comparable estimates of the frequency content of the EEG signal, expressed in units proportional to power (µV²)</w:t>
+      </w:r>
+      <w:r>
+        <w:rPr>
+          <w:rFonts w:ascii="Calibri" w:hAnsi="Calibri" w:cs="Calibri"/>
+          <w:lang w:val="en-US"/>
+        </w:rPr>
+        <w:t xml:space="preserve"> (see figure below)</w:t>
+      </w:r>
+      <w:r>
+        <w:rPr>
+          <w:rFonts w:ascii="Calibri" w:hAnsi="Calibri" w:cs="Calibri"/>
+          <w:lang w:val="en-US"/>
+        </w:rPr>
+        <w:t>. However, differences in normalization mean that the absolute scale is not directly comparable between the two approaches.</w:t>
+      </w:r>
+      <w:r>
+        <w:rPr>
+          <w:rFonts w:ascii="Calibri" w:hAnsi="Calibri" w:cs="Calibri"/>
+          <w:lang w:val="en-US"/>
+        </w:rPr>
+        <w:t xml:space="preserve"> </w:t>
+      </w:r>
+      <w:r>
+        <w:rPr>
+          <w:rFonts w:ascii="Calibri" w:hAnsi="Calibri" w:cs="Calibri"/>
+          <w:lang w:val="en-US"/>
+        </w:rPr>
+        <w:t xml:space="preserve">To be more precise, </w:t>
+      </w:r>
+      <w:r>
+        <w:rPr>
+          <w:rFonts w:ascii="Calibri" w:hAnsi="Calibri" w:cs="Calibri"/>
+          <w:lang w:val="en-US"/>
+        </w:rPr>
+        <w:t xml:space="preserve">FFT </w:t>
+      </w:r>
+      <w:proofErr w:type="spellStart"/>
+      <w:r>
+        <w:rPr>
+          <w:rFonts w:ascii="Calibri" w:hAnsi="Calibri" w:cs="Calibri"/>
+          <w:lang w:val="en-US"/>
+        </w:rPr>
+        <w:t>Matlab</w:t>
+      </w:r>
+      <w:proofErr w:type="spellEnd"/>
+      <w:r>
+        <w:rPr>
+          <w:rFonts w:ascii="Calibri" w:hAnsi="Calibri" w:cs="Calibri"/>
+          <w:lang w:val="en-US"/>
+        </w:rPr>
+        <w:t xml:space="preserve"> provides a power spectral density (µV²/Hz) subject to explicit normalization, while </w:t>
+      </w:r>
+      <w:proofErr w:type="spellStart"/>
+      <w:r>
+        <w:rPr>
+          <w:rFonts w:ascii="Calibri" w:hAnsi="Calibri" w:cs="Calibri"/>
+          <w:lang w:val="en-US"/>
+        </w:rPr>
+        <w:t>eeglab</w:t>
+      </w:r>
+      <w:proofErr w:type="spellEnd"/>
+      <w:r>
+        <w:rPr>
+          <w:rFonts w:ascii="Calibri" w:hAnsi="Calibri" w:cs="Calibri"/>
+          <w:lang w:val="en-US"/>
+        </w:rPr>
+        <w:t xml:space="preserve"> (FFT)</w:t>
+      </w:r>
+      <w:r>
+        <w:rPr>
+          <w:rFonts w:ascii="Calibri" w:hAnsi="Calibri" w:cs="Calibri"/>
+          <w:lang w:val="en-US"/>
+        </w:rPr>
+        <w:t xml:space="preserve"> provides a time-frequency power estimate whose scale depends on the settings and internal method of EEGLAB. Absolute values should therefore not be compared directly between methods.</w:t>
+      </w:r>
+      <w:r>
+        <w:rPr>
+          <w:rFonts w:ascii="Calibri" w:hAnsi="Calibri" w:cs="Calibri"/>
+          <w:lang w:val="en-US"/>
+        </w:rPr>
+        <w:t xml:space="preserve"> </w:t>
       </w:r>
     </w:p>
     <w:p>
@@ -4102,7 +5393,7 @@
           <w:noProof/>
         </w:rPr>
         <w:drawing>
-          <wp:inline distT="0" distB="0" distL="0" distR="0" wp14:anchorId="7E2E93C5" wp14:editId="7DA5FA20">
+          <wp:inline distT="0" distB="0" distL="0" distR="0" wp14:anchorId="7E2E93C5" wp14:editId="12C5191B">
             <wp:extent cx="2757600" cy="2318400"/>
             <wp:effectExtent l="0" t="0" r="5080" b="5715"/>
             <wp:docPr id="1868063784" name="Chart 1">
@@ -4148,7 +5439,47 @@
           <w:bCs/>
           <w:lang w:val="en-US"/>
         </w:rPr>
-        <w:t xml:space="preserve">Should I use the option ‘Fast Fourier Tansform (FFT)’ and ‘eeglab (FFT)’ in point 1? </w:t>
+        <w:t xml:space="preserve">Should I use the option ‘Fast Fourier </w:t>
+      </w:r>
+      <w:proofErr w:type="spellStart"/>
+      <w:r>
+        <w:rPr>
+          <w:rFonts w:ascii="Calibri" w:hAnsi="Calibri" w:cs="Calibri"/>
+          <w:b/>
+          <w:bCs/>
+          <w:lang w:val="en-US"/>
+        </w:rPr>
+        <w:t>Tansform</w:t>
+      </w:r>
+      <w:proofErr w:type="spellEnd"/>
+      <w:r>
+        <w:rPr>
+          <w:rFonts w:ascii="Calibri" w:hAnsi="Calibri" w:cs="Calibri"/>
+          <w:b/>
+          <w:bCs/>
+          <w:lang w:val="en-US"/>
+        </w:rPr>
+        <w:t xml:space="preserve"> (FFT)’ and ‘</w:t>
+      </w:r>
+      <w:proofErr w:type="spellStart"/>
+      <w:r>
+        <w:rPr>
+          <w:rFonts w:ascii="Calibri" w:hAnsi="Calibri" w:cs="Calibri"/>
+          <w:b/>
+          <w:bCs/>
+          <w:lang w:val="en-US"/>
+        </w:rPr>
+        <w:t>eeglab</w:t>
+      </w:r>
+      <w:proofErr w:type="spellEnd"/>
+      <w:r>
+        <w:rPr>
+          <w:rFonts w:ascii="Calibri" w:hAnsi="Calibri" w:cs="Calibri"/>
+          <w:b/>
+          <w:bCs/>
+          <w:lang w:val="en-US"/>
+        </w:rPr>
+        <w:t xml:space="preserve"> (FFT)’ in point 1? </w:t>
       </w:r>
     </w:p>
     <w:p>
@@ -4172,14 +5503,66 @@
           <w:iCs/>
           <w:lang w:val="en-US"/>
         </w:rPr>
-        <w:t>Fast Fourier Tansform (FFT)</w:t>
-      </w:r>
-      <w:r>
-        <w:rPr>
-          <w:rFonts w:ascii="Calibri" w:hAnsi="Calibri" w:cs="Calibri"/>
-          <w:lang w:val="en-US"/>
-        </w:rPr>
-        <w:t xml:space="preserve"> use the standard FFT function of Maltab which is well established. It </w:t>
+        <w:t xml:space="preserve">Fast Fourier </w:t>
+      </w:r>
+      <w:proofErr w:type="spellStart"/>
+      <w:r>
+        <w:rPr>
+          <w:rFonts w:ascii="Calibri" w:hAnsi="Calibri" w:cs="Calibri"/>
+          <w:i/>
+          <w:iCs/>
+          <w:lang w:val="en-US"/>
+        </w:rPr>
+        <w:t>Tansform</w:t>
+      </w:r>
+      <w:proofErr w:type="spellEnd"/>
+      <w:r>
+        <w:rPr>
+          <w:rFonts w:ascii="Calibri" w:hAnsi="Calibri" w:cs="Calibri"/>
+          <w:i/>
+          <w:iCs/>
+          <w:lang w:val="en-US"/>
+        </w:rPr>
+        <w:t xml:space="preserve"> (FFT)</w:t>
+      </w:r>
+      <w:r>
+        <w:rPr>
+          <w:rFonts w:ascii="Calibri" w:hAnsi="Calibri" w:cs="Calibri"/>
+          <w:lang w:val="en-US"/>
+        </w:rPr>
+        <w:t xml:space="preserve"> </w:t>
+      </w:r>
+      <w:proofErr w:type="gramStart"/>
+      <w:r>
+        <w:rPr>
+          <w:rFonts w:ascii="Calibri" w:hAnsi="Calibri" w:cs="Calibri"/>
+          <w:lang w:val="en-US"/>
+        </w:rPr>
+        <w:t>use</w:t>
+      </w:r>
+      <w:proofErr w:type="gramEnd"/>
+      <w:r>
+        <w:rPr>
+          <w:rFonts w:ascii="Calibri" w:hAnsi="Calibri" w:cs="Calibri"/>
+          <w:lang w:val="en-US"/>
+        </w:rPr>
+        <w:t xml:space="preserve"> the standard FFT function of </w:t>
+      </w:r>
+      <w:proofErr w:type="spellStart"/>
+      <w:r>
+        <w:rPr>
+          <w:rFonts w:ascii="Calibri" w:hAnsi="Calibri" w:cs="Calibri"/>
+          <w:lang w:val="en-US"/>
+        </w:rPr>
+        <w:t>Maltab</w:t>
+      </w:r>
+      <w:proofErr w:type="spellEnd"/>
+      <w:r>
+        <w:rPr>
+          <w:rFonts w:ascii="Calibri" w:hAnsi="Calibri" w:cs="Calibri"/>
+          <w:lang w:val="en-US"/>
+        </w:rPr>
+        <w:t xml:space="preserve"> which is well established. It </w:t>
       </w:r>
       <w:r>
         <w:rPr>
@@ -4203,6 +5586,7 @@
         <w:br/>
         <w:t xml:space="preserve">The advantage of the option </w:t>
       </w:r>
+      <w:proofErr w:type="spellStart"/>
       <w:r>
         <w:rPr>
           <w:rFonts w:ascii="Calibri" w:hAnsi="Calibri" w:cs="Calibri"/>
@@ -4210,7 +5594,17 @@
           <w:iCs/>
           <w:lang w:val="en-US"/>
         </w:rPr>
-        <w:t>eeglab (FFT)</w:t>
+        <w:t>eeglab</w:t>
+      </w:r>
+      <w:proofErr w:type="spellEnd"/>
+      <w:r>
+        <w:rPr>
+          <w:rFonts w:ascii="Calibri" w:hAnsi="Calibri" w:cs="Calibri"/>
+          <w:i/>
+          <w:iCs/>
+          <w:lang w:val="en-US"/>
+        </w:rPr>
+        <w:t xml:space="preserve"> (FFT)</w:t>
       </w:r>
       <w:r>
         <w:rPr>
@@ -4224,7 +5618,21 @@
           <w:rFonts w:ascii="Calibri" w:hAnsi="Calibri" w:cs="Calibri"/>
           <w:lang w:val="en-US"/>
         </w:rPr>
-        <w:t xml:space="preserve">function developed by Arneud Delorme is well establish in EEG community and used in many papers. </w:t>
+        <w:t xml:space="preserve">function developed by </w:t>
+      </w:r>
+      <w:r>
+        <w:rPr>
+          <w:rFonts w:ascii="Calibri" w:hAnsi="Calibri" w:cs="Calibri"/>
+          <w:lang w:val="en-US"/>
+        </w:rPr>
+        <w:t>Arnaud</w:t>
+      </w:r>
+      <w:r>
+        <w:rPr>
+          <w:rFonts w:ascii="Calibri" w:hAnsi="Calibri" w:cs="Calibri"/>
+          <w:lang w:val="en-US"/>
+        </w:rPr>
+        <w:t xml:space="preserve"> Delorme is well establish in EEG community and used in many papers. </w:t>
       </w:r>
       <w:r>
         <w:rPr>
@@ -4232,7 +5640,22 @@
           <w:lang w:val="en-US"/>
         </w:rPr>
         <w:br/>
-        <w:t xml:space="preserve">At the end, the statistical results should not be too different. </w:t>
+      </w:r>
+      <w:proofErr w:type="gramStart"/>
+      <w:r>
+        <w:rPr>
+          <w:rFonts w:ascii="Calibri" w:hAnsi="Calibri" w:cs="Calibri"/>
+          <w:lang w:val="en-US"/>
+        </w:rPr>
+        <w:t>At the end</w:t>
+      </w:r>
+      <w:proofErr w:type="gramEnd"/>
+      <w:r>
+        <w:rPr>
+          <w:rFonts w:ascii="Calibri" w:hAnsi="Calibri" w:cs="Calibri"/>
+          <w:lang w:val="en-US"/>
+        </w:rPr>
+        <w:t xml:space="preserve">, the statistical results should not be too different. </w:t>
       </w:r>
     </w:p>
     <w:p>
@@ -4261,8 +5684,9 @@
           <w:bCs/>
           <w:lang w:val="en-US"/>
         </w:rPr>
-        <w:t xml:space="preserve">How is the eeglab command </w:t>
-      </w:r>
+        <w:t xml:space="preserve">How is the </w:t>
+      </w:r>
+      <w:proofErr w:type="spellStart"/>
       <w:r>
         <w:rPr>
           <w:rFonts w:ascii="Calibri" w:hAnsi="Calibri" w:cs="Calibri"/>
@@ -4270,6 +5694,25 @@
           <w:bCs/>
           <w:lang w:val="en-US"/>
         </w:rPr>
+        <w:t>eeglab</w:t>
+      </w:r>
+      <w:proofErr w:type="spellEnd"/>
+      <w:r>
+        <w:rPr>
+          <w:rFonts w:ascii="Calibri" w:hAnsi="Calibri" w:cs="Calibri"/>
+          <w:b/>
+          <w:bCs/>
+          <w:lang w:val="en-US"/>
+        </w:rPr>
+        <w:t xml:space="preserve"> command </w:t>
+      </w:r>
+      <w:r>
+        <w:rPr>
+          <w:rFonts w:ascii="Calibri" w:hAnsi="Calibri" w:cs="Calibri"/>
+          <w:b/>
+          <w:bCs/>
+          <w:lang w:val="en-US"/>
+        </w:rPr>
         <w:t>works?</w:t>
       </w:r>
     </w:p>
@@ -4287,6 +5730,7 @@
         </w:rPr>
         <w:t xml:space="preserve">The important command is </w:t>
       </w:r>
+      <w:proofErr w:type="spellStart"/>
       <w:r>
         <w:rPr>
           <w:rFonts w:ascii="Calibri" w:hAnsi="Calibri" w:cs="Calibri"/>
@@ -4296,28 +5740,291 @@
         </w:rPr>
         <w:t>newtimef</w:t>
       </w:r>
-      <w:r>
-        <w:rPr>
-          <w:rFonts w:ascii="Calibri" w:hAnsi="Calibri" w:cs="Calibri"/>
-          <w:lang w:val="en-US"/>
-        </w:rPr>
-        <w:t xml:space="preserve"> (see its help for details). I will present here the arguments that I have decide to use in the interface of EEGpal. Here is a practical example: </w:t>
-      </w:r>
-    </w:p>
-    <w:p>
-      <w:pPr>
-        <w:rPr>
-          <w:rFonts w:ascii="Calibri" w:hAnsi="Calibri" w:cs="Calibri"/>
-          <w:lang w:val="en-US"/>
-        </w:rPr>
-      </w:pPr>
-      <w:r>
-        <w:rPr>
-          <w:rFonts w:ascii="Calibri" w:hAnsi="Calibri" w:cs="Calibri"/>
-          <w:lang w:val="en-US"/>
-        </w:rPr>
-        <w:t>ersp(:,:,i) = pop_newtimef( EEG, 1, i, [0 350999], 0 , 'baseline',NaN, 'freqs', [8:0.666:13], 'scale', 'abs', 'ntimesout', 234, 'winsize', 1536, 'plotersp', 'off', 'plotitc' , 'off', 'plotphase', 'off');</w:t>
-      </w:r>
+      <w:proofErr w:type="spellEnd"/>
+      <w:r>
+        <w:rPr>
+          <w:rFonts w:ascii="Calibri" w:hAnsi="Calibri" w:cs="Calibri"/>
+          <w:lang w:val="en-US"/>
+        </w:rPr>
+        <w:t xml:space="preserve"> (see its help for details). I will present here the arguments that I have </w:t>
+      </w:r>
+      <w:proofErr w:type="gramStart"/>
+      <w:r>
+        <w:rPr>
+          <w:rFonts w:ascii="Calibri" w:hAnsi="Calibri" w:cs="Calibri"/>
+          <w:lang w:val="en-US"/>
+        </w:rPr>
+        <w:t>decide</w:t>
+      </w:r>
+      <w:proofErr w:type="gramEnd"/>
+      <w:r>
+        <w:rPr>
+          <w:rFonts w:ascii="Calibri" w:hAnsi="Calibri" w:cs="Calibri"/>
+          <w:lang w:val="en-US"/>
+        </w:rPr>
+        <w:t xml:space="preserve"> to use in the interface of </w:t>
+      </w:r>
+      <w:proofErr w:type="spellStart"/>
+      <w:r>
+        <w:rPr>
+          <w:rFonts w:ascii="Calibri" w:hAnsi="Calibri" w:cs="Calibri"/>
+          <w:lang w:val="en-US"/>
+        </w:rPr>
+        <w:t>EEGpal</w:t>
+      </w:r>
+      <w:proofErr w:type="spellEnd"/>
+      <w:r>
+        <w:rPr>
+          <w:rFonts w:ascii="Calibri" w:hAnsi="Calibri" w:cs="Calibri"/>
+          <w:lang w:val="en-US"/>
+        </w:rPr>
+        <w:t xml:space="preserve">. Here is a practical example: </w:t>
+      </w:r>
+    </w:p>
+    <w:p>
+      <w:pPr>
+        <w:rPr>
+          <w:rFonts w:ascii="Calibri" w:hAnsi="Calibri" w:cs="Calibri"/>
+          <w:lang w:val="en-US"/>
+        </w:rPr>
+      </w:pPr>
+      <w:proofErr w:type="spellStart"/>
+      <w:r>
+        <w:rPr>
+          <w:rFonts w:ascii="Calibri" w:hAnsi="Calibri" w:cs="Calibri"/>
+          <w:lang w:val="en-US"/>
+        </w:rPr>
+        <w:t>ersp</w:t>
+      </w:r>
+      <w:proofErr w:type="spellEnd"/>
+      <w:proofErr w:type="gramStart"/>
+      <w:r>
+        <w:rPr>
+          <w:rFonts w:ascii="Calibri" w:hAnsi="Calibri" w:cs="Calibri"/>
+          <w:lang w:val="en-US"/>
+        </w:rPr>
+        <w:t>(:,:,</w:t>
+      </w:r>
+      <w:proofErr w:type="spellStart"/>
+      <w:proofErr w:type="gramEnd"/>
+      <w:r>
+        <w:rPr>
+          <w:rFonts w:ascii="Calibri" w:hAnsi="Calibri" w:cs="Calibri"/>
+          <w:lang w:val="en-US"/>
+        </w:rPr>
+        <w:t>i</w:t>
+      </w:r>
+      <w:proofErr w:type="spellEnd"/>
+      <w:r>
+        <w:rPr>
+          <w:rFonts w:ascii="Calibri" w:hAnsi="Calibri" w:cs="Calibri"/>
+          <w:lang w:val="en-US"/>
+        </w:rPr>
+        <w:t xml:space="preserve">) = </w:t>
+      </w:r>
+      <w:proofErr w:type="spellStart"/>
+      <w:r>
+        <w:rPr>
+          <w:rFonts w:ascii="Calibri" w:hAnsi="Calibri" w:cs="Calibri"/>
+          <w:lang w:val="en-US"/>
+        </w:rPr>
+        <w:t>pop_</w:t>
+      </w:r>
+      <w:proofErr w:type="gramStart"/>
+      <w:r>
+        <w:rPr>
+          <w:rFonts w:ascii="Calibri" w:hAnsi="Calibri" w:cs="Calibri"/>
+          <w:lang w:val="en-US"/>
+        </w:rPr>
+        <w:t>newtimef</w:t>
+      </w:r>
+      <w:proofErr w:type="spellEnd"/>
+      <w:r>
+        <w:rPr>
+          <w:rFonts w:ascii="Calibri" w:hAnsi="Calibri" w:cs="Calibri"/>
+          <w:lang w:val="en-US"/>
+        </w:rPr>
+        <w:t>( EEG</w:t>
+      </w:r>
+      <w:proofErr w:type="gramEnd"/>
+      <w:r>
+        <w:rPr>
+          <w:rFonts w:ascii="Calibri" w:hAnsi="Calibri" w:cs="Calibri"/>
+          <w:lang w:val="en-US"/>
+        </w:rPr>
+        <w:t xml:space="preserve">, 1, </w:t>
+      </w:r>
+      <w:proofErr w:type="spellStart"/>
+      <w:r>
+        <w:rPr>
+          <w:rFonts w:ascii="Calibri" w:hAnsi="Calibri" w:cs="Calibri"/>
+          <w:lang w:val="en-US"/>
+        </w:rPr>
+        <w:t>i</w:t>
+      </w:r>
+      <w:proofErr w:type="spellEnd"/>
+      <w:r>
+        <w:rPr>
+          <w:rFonts w:ascii="Calibri" w:hAnsi="Calibri" w:cs="Calibri"/>
+          <w:lang w:val="en-US"/>
+        </w:rPr>
+        <w:t xml:space="preserve">, [0 350999], </w:t>
+      </w:r>
+      <w:proofErr w:type="gramStart"/>
+      <w:r>
+        <w:rPr>
+          <w:rFonts w:ascii="Calibri" w:hAnsi="Calibri" w:cs="Calibri"/>
+          <w:lang w:val="en-US"/>
+        </w:rPr>
+        <w:t>0 ,</w:t>
+      </w:r>
+      <w:proofErr w:type="gramEnd"/>
+      <w:r>
+        <w:rPr>
+          <w:rFonts w:ascii="Calibri" w:hAnsi="Calibri" w:cs="Calibri"/>
+          <w:lang w:val="en-US"/>
+        </w:rPr>
+        <w:t xml:space="preserve"> 'baseline</w:t>
+      </w:r>
+      <w:proofErr w:type="gramStart"/>
+      <w:r>
+        <w:rPr>
+          <w:rFonts w:ascii="Calibri" w:hAnsi="Calibri" w:cs="Calibri"/>
+          <w:lang w:val="en-US"/>
+        </w:rPr>
+        <w:t>',</w:t>
+      </w:r>
+      <w:proofErr w:type="spellStart"/>
+      <w:r>
+        <w:rPr>
+          <w:rFonts w:ascii="Calibri" w:hAnsi="Calibri" w:cs="Calibri"/>
+          <w:lang w:val="en-US"/>
+        </w:rPr>
+        <w:t>NaN</w:t>
+      </w:r>
+      <w:proofErr w:type="spellEnd"/>
+      <w:proofErr w:type="gramEnd"/>
+      <w:r>
+        <w:rPr>
+          <w:rFonts w:ascii="Calibri" w:hAnsi="Calibri" w:cs="Calibri"/>
+          <w:lang w:val="en-US"/>
+        </w:rPr>
+        <w:t>, '</w:t>
+      </w:r>
+      <w:proofErr w:type="spellStart"/>
+      <w:r>
+        <w:rPr>
+          <w:rFonts w:ascii="Calibri" w:hAnsi="Calibri" w:cs="Calibri"/>
+          <w:lang w:val="en-US"/>
+        </w:rPr>
+        <w:t>freqs</w:t>
+      </w:r>
+      <w:proofErr w:type="spellEnd"/>
+      <w:r>
+        <w:rPr>
+          <w:rFonts w:ascii="Calibri" w:hAnsi="Calibri" w:cs="Calibri"/>
+          <w:lang w:val="en-US"/>
+        </w:rPr>
+        <w:t>', [8:0.666:13], 'scale', 'abs', '</w:t>
+      </w:r>
+      <w:proofErr w:type="spellStart"/>
+      <w:r>
+        <w:rPr>
+          <w:rFonts w:ascii="Calibri" w:hAnsi="Calibri" w:cs="Calibri"/>
+          <w:lang w:val="en-US"/>
+        </w:rPr>
+        <w:t>ntimesout</w:t>
+      </w:r>
+      <w:proofErr w:type="spellEnd"/>
+      <w:r>
+        <w:rPr>
+          <w:rFonts w:ascii="Calibri" w:hAnsi="Calibri" w:cs="Calibri"/>
+          <w:lang w:val="en-US"/>
+        </w:rPr>
+        <w:t>', 234, '</w:t>
+      </w:r>
+      <w:proofErr w:type="spellStart"/>
+      <w:r>
+        <w:rPr>
+          <w:rFonts w:ascii="Calibri" w:hAnsi="Calibri" w:cs="Calibri"/>
+          <w:lang w:val="en-US"/>
+        </w:rPr>
+        <w:t>winsize</w:t>
+      </w:r>
+      <w:proofErr w:type="spellEnd"/>
+      <w:r>
+        <w:rPr>
+          <w:rFonts w:ascii="Calibri" w:hAnsi="Calibri" w:cs="Calibri"/>
+          <w:lang w:val="en-US"/>
+        </w:rPr>
+        <w:t>', 1536, '</w:t>
+      </w:r>
+      <w:proofErr w:type="spellStart"/>
+      <w:r>
+        <w:rPr>
+          <w:rFonts w:ascii="Calibri" w:hAnsi="Calibri" w:cs="Calibri"/>
+          <w:lang w:val="en-US"/>
+        </w:rPr>
+        <w:t>plotersp</w:t>
+      </w:r>
+      <w:proofErr w:type="spellEnd"/>
+      <w:r>
+        <w:rPr>
+          <w:rFonts w:ascii="Calibri" w:hAnsi="Calibri" w:cs="Calibri"/>
+          <w:lang w:val="en-US"/>
+        </w:rPr>
+        <w:t>', 'off', '</w:t>
+      </w:r>
+      <w:proofErr w:type="spellStart"/>
+      <w:r>
+        <w:rPr>
+          <w:rFonts w:ascii="Calibri" w:hAnsi="Calibri" w:cs="Calibri"/>
+          <w:lang w:val="en-US"/>
+        </w:rPr>
+        <w:t>plotitc</w:t>
+      </w:r>
+      <w:proofErr w:type="spellEnd"/>
+      <w:proofErr w:type="gramStart"/>
+      <w:r>
+        <w:rPr>
+          <w:rFonts w:ascii="Calibri" w:hAnsi="Calibri" w:cs="Calibri"/>
+          <w:lang w:val="en-US"/>
+        </w:rPr>
+        <w:t>' ,</w:t>
+      </w:r>
+      <w:proofErr w:type="gramEnd"/>
+      <w:r>
+        <w:rPr>
+          <w:rFonts w:ascii="Calibri" w:hAnsi="Calibri" w:cs="Calibri"/>
+          <w:lang w:val="en-US"/>
+        </w:rPr>
+        <w:t xml:space="preserve"> 'off', '</w:t>
+      </w:r>
+      <w:proofErr w:type="spellStart"/>
+      <w:r>
+        <w:rPr>
+          <w:rFonts w:ascii="Calibri" w:hAnsi="Calibri" w:cs="Calibri"/>
+          <w:lang w:val="en-US"/>
+        </w:rPr>
+        <w:t>plotphase</w:t>
+      </w:r>
+      <w:proofErr w:type="spellEnd"/>
+      <w:r>
+        <w:rPr>
+          <w:rFonts w:ascii="Calibri" w:hAnsi="Calibri" w:cs="Calibri"/>
+          <w:lang w:val="en-US"/>
+        </w:rPr>
+        <w:t>', 'off'</w:t>
+      </w:r>
+      <w:proofErr w:type="gramStart"/>
+      <w:r>
+        <w:rPr>
+          <w:rFonts w:ascii="Calibri" w:hAnsi="Calibri" w:cs="Calibri"/>
+          <w:lang w:val="en-US"/>
+        </w:rPr>
+        <w:t>);</w:t>
+      </w:r>
+      <w:proofErr w:type="gramEnd"/>
     </w:p>
     <w:p>
       <w:pPr>
@@ -4354,12 +6061,37 @@
           <w:lang w:val="en-US"/>
         </w:rPr>
       </w:pPr>
-      <w:r>
-        <w:rPr>
-          <w:rFonts w:ascii="Calibri" w:hAnsi="Calibri" w:cs="Calibri"/>
-          <w:lang w:val="en-US"/>
-        </w:rPr>
-        <w:t>EEG : input data struct in eeglab format</w:t>
+      <w:proofErr w:type="gramStart"/>
+      <w:r>
+        <w:rPr>
+          <w:rFonts w:ascii="Calibri" w:hAnsi="Calibri" w:cs="Calibri"/>
+          <w:lang w:val="en-US"/>
+        </w:rPr>
+        <w:t>EEG :</w:t>
+      </w:r>
+      <w:proofErr w:type="gramEnd"/>
+      <w:r>
+        <w:rPr>
+          <w:rFonts w:ascii="Calibri" w:hAnsi="Calibri" w:cs="Calibri"/>
+          <w:lang w:val="en-US"/>
+        </w:rPr>
+        <w:t xml:space="preserve"> input data struct in </w:t>
+      </w:r>
+      <w:proofErr w:type="spellStart"/>
+      <w:r>
+        <w:rPr>
+          <w:rFonts w:ascii="Calibri" w:hAnsi="Calibri" w:cs="Calibri"/>
+          <w:lang w:val="en-US"/>
+        </w:rPr>
+        <w:t>eeglab</w:t>
+      </w:r>
+      <w:proofErr w:type="spellEnd"/>
+      <w:r>
+        <w:rPr>
+          <w:rFonts w:ascii="Calibri" w:hAnsi="Calibri" w:cs="Calibri"/>
+          <w:lang w:val="en-US"/>
+        </w:rPr>
+        <w:t xml:space="preserve"> format</w:t>
       </w:r>
     </w:p>
     <w:p>
@@ -4374,12 +6106,21 @@
           <w:lang w:val="en-US"/>
         </w:rPr>
       </w:pPr>
-      <w:r>
-        <w:rPr>
-          <w:rFonts w:ascii="Calibri" w:hAnsi="Calibri" w:cs="Calibri"/>
-          <w:lang w:val="en-US"/>
-        </w:rPr>
-        <w:t>1 : frame per trial (ignored)</w:t>
+      <w:proofErr w:type="gramStart"/>
+      <w:r>
+        <w:rPr>
+          <w:rFonts w:ascii="Calibri" w:hAnsi="Calibri" w:cs="Calibri"/>
+          <w:lang w:val="en-US"/>
+        </w:rPr>
+        <w:t>1 :</w:t>
+      </w:r>
+      <w:proofErr w:type="gramEnd"/>
+      <w:r>
+        <w:rPr>
+          <w:rFonts w:ascii="Calibri" w:hAnsi="Calibri" w:cs="Calibri"/>
+          <w:lang w:val="en-US"/>
+        </w:rPr>
+        <w:t xml:space="preserve"> frame per trial (ignored)</w:t>
       </w:r>
     </w:p>
     <w:p>
@@ -4394,12 +6135,46 @@
           <w:lang w:val="en-US"/>
         </w:rPr>
       </w:pPr>
-      <w:r>
-        <w:rPr>
-          <w:rFonts w:ascii="Calibri" w:hAnsi="Calibri" w:cs="Calibri"/>
-          <w:lang w:val="en-US"/>
-        </w:rPr>
-        <w:t>i : the indice of the current electrode studied</w:t>
+      <w:proofErr w:type="spellStart"/>
+      <w:proofErr w:type="gramStart"/>
+      <w:r>
+        <w:rPr>
+          <w:rFonts w:ascii="Calibri" w:hAnsi="Calibri" w:cs="Calibri"/>
+          <w:lang w:val="en-US"/>
+        </w:rPr>
+        <w:t>i</w:t>
+      </w:r>
+      <w:proofErr w:type="spellEnd"/>
+      <w:r>
+        <w:rPr>
+          <w:rFonts w:ascii="Calibri" w:hAnsi="Calibri" w:cs="Calibri"/>
+          <w:lang w:val="en-US"/>
+        </w:rPr>
+        <w:t xml:space="preserve"> :</w:t>
+      </w:r>
+      <w:proofErr w:type="gramEnd"/>
+      <w:r>
+        <w:rPr>
+          <w:rFonts w:ascii="Calibri" w:hAnsi="Calibri" w:cs="Calibri"/>
+          <w:lang w:val="en-US"/>
+        </w:rPr>
+        <w:t xml:space="preserve"> the </w:t>
+      </w:r>
+      <w:proofErr w:type="spellStart"/>
+      <w:r>
+        <w:rPr>
+          <w:rFonts w:ascii="Calibri" w:hAnsi="Calibri" w:cs="Calibri"/>
+          <w:lang w:val="en-US"/>
+        </w:rPr>
+        <w:t>indice</w:t>
+      </w:r>
+      <w:proofErr w:type="spellEnd"/>
+      <w:r>
+        <w:rPr>
+          <w:rFonts w:ascii="Calibri" w:hAnsi="Calibri" w:cs="Calibri"/>
+          <w:lang w:val="en-US"/>
+        </w:rPr>
+        <w:t xml:space="preserve"> of the current electrode studied</w:t>
       </w:r>
     </w:p>
     <w:p>
@@ -4419,7 +6194,39 @@
           <w:rFonts w:ascii="Calibri" w:hAnsi="Calibri" w:cs="Calibri"/>
           <w:lang w:val="en-US"/>
         </w:rPr>
-        <w:t xml:space="preserve">[0 350999] : the onset and offset time point in ms that you want to study (point </w:t>
+        <w:t>[0 350999</w:t>
+      </w:r>
+      <w:proofErr w:type="gramStart"/>
+      <w:r>
+        <w:rPr>
+          <w:rFonts w:ascii="Calibri" w:hAnsi="Calibri" w:cs="Calibri"/>
+          <w:lang w:val="en-US"/>
+        </w:rPr>
+        <w:t>] :</w:t>
+      </w:r>
+      <w:proofErr w:type="gramEnd"/>
+      <w:r>
+        <w:rPr>
+          <w:rFonts w:ascii="Calibri" w:hAnsi="Calibri" w:cs="Calibri"/>
+          <w:lang w:val="en-US"/>
+        </w:rPr>
+        <w:t xml:space="preserve"> the onset and offset time point in </w:t>
+      </w:r>
+      <w:proofErr w:type="spellStart"/>
+      <w:r>
+        <w:rPr>
+          <w:rFonts w:ascii="Calibri" w:hAnsi="Calibri" w:cs="Calibri"/>
+          <w:lang w:val="en-US"/>
+        </w:rPr>
+        <w:t>ms</w:t>
+      </w:r>
+      <w:proofErr w:type="spellEnd"/>
+      <w:r>
+        <w:rPr>
+          <w:rFonts w:ascii="Calibri" w:hAnsi="Calibri" w:cs="Calibri"/>
+          <w:lang w:val="en-US"/>
+        </w:rPr>
+        <w:t xml:space="preserve"> that you want to study (point </w:t>
       </w:r>
       <w:r>
         <w:rPr>
@@ -4450,12 +6257,53 @@
           <w:lang w:val="en-US"/>
         </w:rPr>
       </w:pPr>
-      <w:r>
-        <w:rPr>
-          <w:rFonts w:ascii="Calibri" w:hAnsi="Calibri" w:cs="Calibri"/>
-          <w:lang w:val="en-US"/>
-        </w:rPr>
-        <w:t xml:space="preserve">0 : This parameter permit to study the power with FFT. The function allow you to use a wavelet decomposition instead (if you </w:t>
+      <w:proofErr w:type="gramStart"/>
+      <w:r>
+        <w:rPr>
+          <w:rFonts w:ascii="Calibri" w:hAnsi="Calibri" w:cs="Calibri"/>
+          <w:lang w:val="en-US"/>
+        </w:rPr>
+        <w:t>0 :</w:t>
+      </w:r>
+      <w:proofErr w:type="gramEnd"/>
+      <w:r>
+        <w:rPr>
+          <w:rFonts w:ascii="Calibri" w:hAnsi="Calibri" w:cs="Calibri"/>
+          <w:lang w:val="en-US"/>
+        </w:rPr>
+        <w:t xml:space="preserve"> This parameter </w:t>
+      </w:r>
+      <w:proofErr w:type="gramStart"/>
+      <w:r>
+        <w:rPr>
+          <w:rFonts w:ascii="Calibri" w:hAnsi="Calibri" w:cs="Calibri"/>
+          <w:lang w:val="en-US"/>
+        </w:rPr>
+        <w:t>permit</w:t>
+      </w:r>
+      <w:proofErr w:type="gramEnd"/>
+      <w:r>
+        <w:rPr>
+          <w:rFonts w:ascii="Calibri" w:hAnsi="Calibri" w:cs="Calibri"/>
+          <w:lang w:val="en-US"/>
+        </w:rPr>
+        <w:t xml:space="preserve"> to study </w:t>
+      </w:r>
+      <w:proofErr w:type="gramStart"/>
+      <w:r>
+        <w:rPr>
+          <w:rFonts w:ascii="Calibri" w:hAnsi="Calibri" w:cs="Calibri"/>
+          <w:lang w:val="en-US"/>
+        </w:rPr>
+        <w:t>the power</w:t>
+      </w:r>
+      <w:proofErr w:type="gramEnd"/>
+      <w:r>
+        <w:rPr>
+          <w:rFonts w:ascii="Calibri" w:hAnsi="Calibri" w:cs="Calibri"/>
+          <w:lang w:val="en-US"/>
+        </w:rPr>
+        <w:t xml:space="preserve"> with FFT. The function allow you to use a wavelet decomposition instead (if you </w:t>
       </w:r>
       <w:r>
         <w:rPr>
@@ -4479,7 +6327,63 @@
           <w:rFonts w:ascii="Calibri" w:hAnsi="Calibri" w:cs="Calibri"/>
           <w:lang w:val="en-US"/>
         </w:rPr>
-        <w:t>). This option is not integrated inside of EEGpal. To use it, you have to pass by the GUI from eeglab (“Plot-&gt;Channel time-frequency”).</w:t>
+        <w:t xml:space="preserve">). This option is not integrated inside </w:t>
+      </w:r>
+      <w:r>
+        <w:rPr>
+          <w:rFonts w:ascii="Calibri" w:hAnsi="Calibri" w:cs="Calibri"/>
+          <w:lang w:val="en-US"/>
+        </w:rPr>
+        <w:lastRenderedPageBreak/>
+        <w:t xml:space="preserve">of </w:t>
+      </w:r>
+      <w:proofErr w:type="spellStart"/>
+      <w:r>
+        <w:rPr>
+          <w:rFonts w:ascii="Calibri" w:hAnsi="Calibri" w:cs="Calibri"/>
+          <w:lang w:val="en-US"/>
+        </w:rPr>
+        <w:t>EEGpal</w:t>
+      </w:r>
+      <w:proofErr w:type="spellEnd"/>
+      <w:r>
+        <w:rPr>
+          <w:rFonts w:ascii="Calibri" w:hAnsi="Calibri" w:cs="Calibri"/>
+          <w:lang w:val="en-US"/>
+        </w:rPr>
+        <w:t xml:space="preserve">. To use it, you </w:t>
+      </w:r>
+      <w:proofErr w:type="gramStart"/>
+      <w:r>
+        <w:rPr>
+          <w:rFonts w:ascii="Calibri" w:hAnsi="Calibri" w:cs="Calibri"/>
+          <w:lang w:val="en-US"/>
+        </w:rPr>
+        <w:t>have to</w:t>
+      </w:r>
+      <w:proofErr w:type="gramEnd"/>
+      <w:r>
+        <w:rPr>
+          <w:rFonts w:ascii="Calibri" w:hAnsi="Calibri" w:cs="Calibri"/>
+          <w:lang w:val="en-US"/>
+        </w:rPr>
+        <w:t xml:space="preserve"> pass by the GUI from </w:t>
+      </w:r>
+      <w:proofErr w:type="spellStart"/>
+      <w:r>
+        <w:rPr>
+          <w:rFonts w:ascii="Calibri" w:hAnsi="Calibri" w:cs="Calibri"/>
+          <w:lang w:val="en-US"/>
+        </w:rPr>
+        <w:t>eeglab</w:t>
+      </w:r>
+      <w:proofErr w:type="spellEnd"/>
+      <w:r>
+        <w:rPr>
+          <w:rFonts w:ascii="Calibri" w:hAnsi="Calibri" w:cs="Calibri"/>
+          <w:lang w:val="en-US"/>
+        </w:rPr>
+        <w:t xml:space="preserve"> (“Plot-&gt;Channel time-frequency”).</w:t>
       </w:r>
     </w:p>
     <w:p>
@@ -4499,7 +6403,32 @@
           <w:rFonts w:ascii="Calibri" w:hAnsi="Calibri" w:cs="Calibri"/>
           <w:lang w:val="en-US"/>
         </w:rPr>
-        <w:t>'baseline',NaN: Deactivation of any baseline correction</w:t>
+        <w:t>'baseline</w:t>
+      </w:r>
+      <w:proofErr w:type="gramStart"/>
+      <w:r>
+        <w:rPr>
+          <w:rFonts w:ascii="Calibri" w:hAnsi="Calibri" w:cs="Calibri"/>
+          <w:lang w:val="en-US"/>
+        </w:rPr>
+        <w:t>',</w:t>
+      </w:r>
+      <w:proofErr w:type="spellStart"/>
+      <w:r>
+        <w:rPr>
+          <w:rFonts w:ascii="Calibri" w:hAnsi="Calibri" w:cs="Calibri"/>
+          <w:lang w:val="en-US"/>
+        </w:rPr>
+        <w:t>NaN</w:t>
+      </w:r>
+      <w:proofErr w:type="spellEnd"/>
+      <w:proofErr w:type="gramEnd"/>
+      <w:r>
+        <w:rPr>
+          <w:rFonts w:ascii="Calibri" w:hAnsi="Calibri" w:cs="Calibri"/>
+          <w:lang w:val="en-US"/>
+        </w:rPr>
+        <w:t>: Deactivation of any baseline correction</w:t>
       </w:r>
     </w:p>
     <w:p>
@@ -4519,7 +6448,23 @@
           <w:rFonts w:ascii="Calibri" w:hAnsi="Calibri" w:cs="Calibri"/>
           <w:lang w:val="en-US"/>
         </w:rPr>
-        <w:t xml:space="preserve">'freqs', [8:0.666:13]: The vectors of frequencies which will be studied (point </w:t>
+        <w:t>'</w:t>
+      </w:r>
+      <w:proofErr w:type="spellStart"/>
+      <w:r>
+        <w:rPr>
+          <w:rFonts w:ascii="Calibri" w:hAnsi="Calibri" w:cs="Calibri"/>
+          <w:lang w:val="en-US"/>
+        </w:rPr>
+        <w:t>freqs</w:t>
+      </w:r>
+      <w:proofErr w:type="spellEnd"/>
+      <w:r>
+        <w:rPr>
+          <w:rFonts w:ascii="Calibri" w:hAnsi="Calibri" w:cs="Calibri"/>
+          <w:lang w:val="en-US"/>
+        </w:rPr>
+        <w:t xml:space="preserve">', [8:0.666:13]: The vectors of frequencies which will be studied (point </w:t>
       </w:r>
       <w:r>
         <w:rPr>
@@ -4555,7 +6500,6 @@
           <w:rFonts w:ascii="Calibri" w:hAnsi="Calibri" w:cs="Calibri"/>
           <w:lang w:val="en-US"/>
         </w:rPr>
-        <w:lastRenderedPageBreak/>
         <w:t>'scale', 'abs': Force to keep absolute value and not dB (10log</w:t>
       </w:r>
       <w:r>
@@ -4591,7 +6535,23 @@
           <w:rFonts w:ascii="Calibri" w:hAnsi="Calibri" w:cs="Calibri"/>
           <w:lang w:val="en-US"/>
         </w:rPr>
-        <w:t xml:space="preserve">'ntimesout', 234: Number of windows (point </w:t>
+        <w:t>'</w:t>
+      </w:r>
+      <w:proofErr w:type="spellStart"/>
+      <w:r>
+        <w:rPr>
+          <w:rFonts w:ascii="Calibri" w:hAnsi="Calibri" w:cs="Calibri"/>
+          <w:lang w:val="en-US"/>
+        </w:rPr>
+        <w:t>ntimesout</w:t>
+      </w:r>
+      <w:proofErr w:type="spellEnd"/>
+      <w:r>
+        <w:rPr>
+          <w:rFonts w:ascii="Calibri" w:hAnsi="Calibri" w:cs="Calibri"/>
+          <w:lang w:val="en-US"/>
+        </w:rPr>
+        <w:t xml:space="preserve">', 234: Number of windows (point </w:t>
       </w:r>
       <w:r>
         <w:rPr>
@@ -4627,7 +6587,23 @@
           <w:rFonts w:ascii="Calibri" w:hAnsi="Calibri" w:cs="Calibri"/>
           <w:lang w:val="en-US"/>
         </w:rPr>
-        <w:t xml:space="preserve">'winsize', 1536: window size in TF (point </w:t>
+        <w:t>'</w:t>
+      </w:r>
+      <w:proofErr w:type="spellStart"/>
+      <w:r>
+        <w:rPr>
+          <w:rFonts w:ascii="Calibri" w:hAnsi="Calibri" w:cs="Calibri"/>
+          <w:lang w:val="en-US"/>
+        </w:rPr>
+        <w:t>winsize</w:t>
+      </w:r>
+      <w:proofErr w:type="spellEnd"/>
+      <w:r>
+        <w:rPr>
+          <w:rFonts w:ascii="Calibri" w:hAnsi="Calibri" w:cs="Calibri"/>
+          <w:lang w:val="en-US"/>
+        </w:rPr>
+        <w:t xml:space="preserve">', 1536: window size in TF (point </w:t>
       </w:r>
       <w:r>
         <w:rPr>
@@ -4663,7 +6639,80 @@
           <w:rFonts w:ascii="Calibri" w:hAnsi="Calibri" w:cs="Calibri"/>
           <w:lang w:val="en-US"/>
         </w:rPr>
-        <w:t>'plotersp', 'off', 'plotitc' , 'off', 'plotphase', 'off': Deactivation of eeglab plots.</w:t>
+        <w:t>'</w:t>
+      </w:r>
+      <w:proofErr w:type="spellStart"/>
+      <w:r>
+        <w:rPr>
+          <w:rFonts w:ascii="Calibri" w:hAnsi="Calibri" w:cs="Calibri"/>
+          <w:lang w:val="en-US"/>
+        </w:rPr>
+        <w:t>plotersp</w:t>
+      </w:r>
+      <w:proofErr w:type="spellEnd"/>
+      <w:r>
+        <w:rPr>
+          <w:rFonts w:ascii="Calibri" w:hAnsi="Calibri" w:cs="Calibri"/>
+          <w:lang w:val="en-US"/>
+        </w:rPr>
+        <w:t>', 'off', '</w:t>
+      </w:r>
+      <w:proofErr w:type="spellStart"/>
+      <w:r>
+        <w:rPr>
+          <w:rFonts w:ascii="Calibri" w:hAnsi="Calibri" w:cs="Calibri"/>
+          <w:lang w:val="en-US"/>
+        </w:rPr>
+        <w:t>plotitc</w:t>
+      </w:r>
+      <w:proofErr w:type="spellEnd"/>
+      <w:proofErr w:type="gramStart"/>
+      <w:r>
+        <w:rPr>
+          <w:rFonts w:ascii="Calibri" w:hAnsi="Calibri" w:cs="Calibri"/>
+          <w:lang w:val="en-US"/>
+        </w:rPr>
+        <w:t>' ,</w:t>
+      </w:r>
+      <w:proofErr w:type="gramEnd"/>
+      <w:r>
+        <w:rPr>
+          <w:rFonts w:ascii="Calibri" w:hAnsi="Calibri" w:cs="Calibri"/>
+          <w:lang w:val="en-US"/>
+        </w:rPr>
+        <w:t xml:space="preserve"> 'off', '</w:t>
+      </w:r>
+      <w:proofErr w:type="spellStart"/>
+      <w:r>
+        <w:rPr>
+          <w:rFonts w:ascii="Calibri" w:hAnsi="Calibri" w:cs="Calibri"/>
+          <w:lang w:val="en-US"/>
+        </w:rPr>
+        <w:t>plotphase</w:t>
+      </w:r>
+      <w:proofErr w:type="spellEnd"/>
+      <w:r>
+        <w:rPr>
+          <w:rFonts w:ascii="Calibri" w:hAnsi="Calibri" w:cs="Calibri"/>
+          <w:lang w:val="en-US"/>
+        </w:rPr>
+        <w:t xml:space="preserve">', 'off': Deactivation of </w:t>
+      </w:r>
+      <w:proofErr w:type="spellStart"/>
+      <w:r>
+        <w:rPr>
+          <w:rFonts w:ascii="Calibri" w:hAnsi="Calibri" w:cs="Calibri"/>
+          <w:lang w:val="en-US"/>
+        </w:rPr>
+        <w:t>eeglab</w:t>
+      </w:r>
+      <w:proofErr w:type="spellEnd"/>
+      <w:r>
+        <w:rPr>
+          <w:rFonts w:ascii="Calibri" w:hAnsi="Calibri" w:cs="Calibri"/>
+          <w:lang w:val="en-US"/>
+        </w:rPr>
+        <w:t xml:space="preserve"> plots.</w:t>
       </w:r>
     </w:p>
     <w:p>
@@ -4693,12 +6742,21 @@
           <w:lang w:val="en-US"/>
         </w:rPr>
       </w:pPr>
-      <w:r>
-        <w:rPr>
-          <w:rFonts w:ascii="Calibri" w:hAnsi="Calibri" w:cs="Calibri"/>
-          <w:lang w:val="en-US"/>
-        </w:rPr>
-        <w:t xml:space="preserve">ersp: Event-Related Spectral Perturbation (FFT), frequencies X time-windows </w:t>
+      <w:proofErr w:type="spellStart"/>
+      <w:r>
+        <w:rPr>
+          <w:rFonts w:ascii="Calibri" w:hAnsi="Calibri" w:cs="Calibri"/>
+          <w:lang w:val="en-US"/>
+        </w:rPr>
+        <w:t>ersp</w:t>
+      </w:r>
+      <w:proofErr w:type="spellEnd"/>
+      <w:r>
+        <w:rPr>
+          <w:rFonts w:ascii="Calibri" w:hAnsi="Calibri" w:cs="Calibri"/>
+          <w:lang w:val="en-US"/>
+        </w:rPr>
+        <w:t xml:space="preserve">: Event-Related Spectral Perturbation (FFT), frequencies X time-windows </w:t>
       </w:r>
     </w:p>
     <w:p>
@@ -7930,7 +9988,7 @@
                       </a:prstClr>
                     </a:solidFill>
                   </a:rPr>
-                  <a:t>Power </a:t>
+                  <a:t>Power</a:t>
                 </a:r>
                 <a:r>
                   <a:rPr lang="en-US" sz="800" b="0" i="0" u="none" strike="noStrike" kern="1200" baseline="0" dirty="0">
@@ -7943,33 +10001,7 @@
                     <a:latin typeface="Calibri" panose="020F0502020204030204" pitchFamily="34" charset="0"/>
                     <a:cs typeface="Calibri" panose="020F0502020204030204" pitchFamily="34" charset="0"/>
                   </a:rPr>
-                  <a:t>µV</a:t>
-                </a:r>
-                <a:r>
-                  <a:rPr lang="en-US" sz="800" b="0" i="0" u="none" strike="noStrike" kern="1200" baseline="30000" dirty="0">
-                    <a:solidFill>
-                      <a:prstClr val="black">
-                        <a:lumMod val="65000"/>
-                        <a:lumOff val="35000"/>
-                      </a:prstClr>
-                    </a:solidFill>
-                    <a:latin typeface="Calibri" panose="020F0502020204030204" pitchFamily="34" charset="0"/>
-                    <a:cs typeface="Calibri" panose="020F0502020204030204" pitchFamily="34" charset="0"/>
-                  </a:rPr>
-                  <a:t>2</a:t>
-                </a:r>
-                <a:r>
-                  <a:rPr lang="en-US" sz="800" b="0" i="0" u="none" strike="noStrike" kern="1200" baseline="0" dirty="0">
-                    <a:solidFill>
-                      <a:prstClr val="black">
-                        <a:lumMod val="65000"/>
-                        <a:lumOff val="35000"/>
-                      </a:prstClr>
-                    </a:solidFill>
-                    <a:latin typeface="Calibri" panose="020F0502020204030204" pitchFamily="34" charset="0"/>
-                    <a:cs typeface="Calibri" panose="020F0502020204030204" pitchFamily="34" charset="0"/>
-                  </a:rPr>
-                  <a:t>/Hz </a:t>
+                  <a:t> </a:t>
                 </a:r>
                 <a:r>
                   <a:rPr lang="en-US" sz="1000" b="0" i="0" u="none" strike="noStrike" kern="1200" baseline="0" dirty="0">

</xml_diff>